<commit_message>
ML midterm reviewer: add Part 5 code and imports
Co-Authored-By: Claude Sonnet 5.5 <noreply@anthropic.com>
</commit_message>
<xml_diff>
--- a/Machine Learning Algorithm/PAMESA - ML Midterm Reviewer.docx
+++ b/Machine Learning Algorithm/PAMESA - ML Midterm Reviewer.docx
@@ -52,7 +52,7 @@
         <w:rPr>
           <w:b/>
         </w:rPr>
-        <w:t>(1) core concepts, (2) evaluation and complexity, (3) the algorithms, (4) traps</w:t>
+        <w:t>(1) core concepts, (2) evaluation and complexity, (3) the algorithms, (4) traps, (5) code and imports</w:t>
       </w:r>
       <w:r>
         <w:rPr>
@@ -12783,6 +12783,1828 @@
       </w:pPr>
     </w:p>
     <w:p>
+      <w:pPr>
+        <w:pStyle w:val="Heading1"/>
+      </w:pPr>
+      <w:r>
+        <w:t>Part 5. Code and Imports</w:t>
+      </w:r>
+    </w:p>
+    <w:p>
+      <w:pPr>
+        <w:spacing w:after="120"/>
+      </w:pPr>
+      <w:r>
+        <w:rPr>
+          <w:b w:val="0"/>
+        </w:rPr>
+        <w:t xml:space="preserve">Reported exam format: </w:t>
+      </w:r>
+      <w:r>
+        <w:rPr>
+          <w:b/>
+        </w:rPr>
+        <w:t>fill-in-the-blank imports</w:t>
+      </w:r>
+      <w:r>
+        <w:rPr>
+          <w:b w:val="0"/>
+        </w:rPr>
+        <w:t xml:space="preserve"> (like import ____ as np) and </w:t>
+      </w:r>
+      <w:r>
+        <w:rPr>
+          <w:b/>
+        </w:rPr>
+        <w:t>two 7-point code items</w:t>
+      </w:r>
+      <w:r>
+        <w:rPr>
+          <w:b w:val="0"/>
+        </w:rPr>
+        <w:t xml:space="preserve"> where you complete missing code taken from the module. Everything in this part is copied from the prof's M2.ipynb and the M1 preprocessing notebook.</w:t>
+      </w:r>
+    </w:p>
+    <w:p>
+      <w:pPr>
+        <w:pStyle w:val="Heading2"/>
+      </w:pPr>
+      <w:r>
+        <w:t>Imports From The Module</w:t>
+      </w:r>
+    </w:p>
+    <w:tbl>
+      <w:tblPr>
+        <w:tblStyle w:val="TableGrid"/>
+        <w:tblW w:type="auto" w:w="0"/>
+        <w:jc w:val="center"/>
+        <w:tblLook w:firstColumn="1" w:firstRow="1" w:lastColumn="0" w:lastRow="0" w:noHBand="0" w:noVBand="1" w:val="04A0"/>
+      </w:tblPr>
+      <w:tblGrid>
+        <w:gridCol w:w="4680"/>
+        <w:gridCol w:w="4680"/>
+      </w:tblGrid>
+      <w:tr>
+        <w:tc>
+          <w:tcPr>
+            <w:tcW w:type="dxa" w:w="2880"/>
+            <w:shd w:val="clear" w:color="auto" w:fill="D9D9D9"/>
+          </w:tcPr>
+          <w:p>
+            <w:r/>
+            <w:r>
+              <w:rPr>
+                <w:b/>
+              </w:rPr>
+              <w:t>What</w:t>
+            </w:r>
+          </w:p>
+        </w:tc>
+        <w:tc>
+          <w:tcPr>
+            <w:tcW w:type="dxa" w:w="6480"/>
+            <w:shd w:val="clear" w:color="auto" w:fill="D9D9D9"/>
+          </w:tcPr>
+          <w:p>
+            <w:r/>
+            <w:r>
+              <w:rPr>
+                <w:b/>
+              </w:rPr>
+              <w:t>Import line</w:t>
+            </w:r>
+          </w:p>
+        </w:tc>
+      </w:tr>
+      <w:tr>
+        <w:tc>
+          <w:tcPr>
+            <w:tcW w:type="dxa" w:w="2880"/>
+          </w:tcPr>
+          <w:p>
+            <w:r/>
+            <w:r>
+              <w:rPr>
+                <w:b w:val="0"/>
+              </w:rPr>
+              <w:t>NumPy</w:t>
+            </w:r>
+          </w:p>
+        </w:tc>
+        <w:tc>
+          <w:tcPr>
+            <w:tcW w:type="dxa" w:w="6480"/>
+          </w:tcPr>
+          <w:p>
+            <w:r/>
+            <w:r>
+              <w:rPr>
+                <w:b w:val="0"/>
+              </w:rPr>
+              <w:t>import numpy as np</w:t>
+            </w:r>
+          </w:p>
+        </w:tc>
+      </w:tr>
+      <w:tr>
+        <w:tc>
+          <w:tcPr>
+            <w:tcW w:type="dxa" w:w="2880"/>
+          </w:tcPr>
+          <w:p>
+            <w:r/>
+            <w:r>
+              <w:rPr>
+                <w:b w:val="0"/>
+              </w:rPr>
+              <w:t>pandas</w:t>
+            </w:r>
+          </w:p>
+        </w:tc>
+        <w:tc>
+          <w:tcPr>
+            <w:tcW w:type="dxa" w:w="6480"/>
+          </w:tcPr>
+          <w:p>
+            <w:r/>
+            <w:r>
+              <w:rPr>
+                <w:b w:val="0"/>
+              </w:rPr>
+              <w:t>import pandas as pd</w:t>
+            </w:r>
+          </w:p>
+        </w:tc>
+      </w:tr>
+      <w:tr>
+        <w:tc>
+          <w:tcPr>
+            <w:tcW w:type="dxa" w:w="2880"/>
+          </w:tcPr>
+          <w:p>
+            <w:r/>
+            <w:r>
+              <w:rPr>
+                <w:b w:val="0"/>
+              </w:rPr>
+              <w:t>Matplotlib</w:t>
+            </w:r>
+          </w:p>
+        </w:tc>
+        <w:tc>
+          <w:tcPr>
+            <w:tcW w:type="dxa" w:w="6480"/>
+          </w:tcPr>
+          <w:p>
+            <w:r/>
+            <w:r>
+              <w:rPr>
+                <w:b w:val="0"/>
+              </w:rPr>
+              <w:t>import matplotlib.pyplot as plt</w:t>
+            </w:r>
+          </w:p>
+        </w:tc>
+      </w:tr>
+      <w:tr>
+        <w:tc>
+          <w:tcPr>
+            <w:tcW w:type="dxa" w:w="2880"/>
+          </w:tcPr>
+          <w:p>
+            <w:r/>
+            <w:r>
+              <w:rPr>
+                <w:b w:val="0"/>
+              </w:rPr>
+              <w:t>mglearn</w:t>
+            </w:r>
+          </w:p>
+        </w:tc>
+        <w:tc>
+          <w:tcPr>
+            <w:tcW w:type="dxa" w:w="6480"/>
+          </w:tcPr>
+          <w:p>
+            <w:r/>
+            <w:r>
+              <w:rPr>
+                <w:b w:val="0"/>
+              </w:rPr>
+              <w:t>import mglearn</w:t>
+            </w:r>
+          </w:p>
+        </w:tc>
+      </w:tr>
+      <w:tr>
+        <w:tc>
+          <w:tcPr>
+            <w:tcW w:type="dxa" w:w="2880"/>
+          </w:tcPr>
+          <w:p>
+            <w:r/>
+            <w:r>
+              <w:rPr>
+                <w:b w:val="0"/>
+              </w:rPr>
+              <w:t>Legend patches</w:t>
+            </w:r>
+          </w:p>
+        </w:tc>
+        <w:tc>
+          <w:tcPr>
+            <w:tcW w:type="dxa" w:w="6480"/>
+          </w:tcPr>
+          <w:p>
+            <w:r/>
+            <w:r>
+              <w:rPr>
+                <w:b w:val="0"/>
+              </w:rPr>
+              <w:t>import matplotlib.patches as mpatches</w:t>
+            </w:r>
+          </w:p>
+        </w:tc>
+      </w:tr>
+      <w:tr>
+        <w:tc>
+          <w:tcPr>
+            <w:tcW w:type="dxa" w:w="2880"/>
+          </w:tcPr>
+          <w:p>
+            <w:r/>
+            <w:r>
+              <w:rPr>
+                <w:b w:val="0"/>
+              </w:rPr>
+              <w:t>Iris data</w:t>
+            </w:r>
+          </w:p>
+        </w:tc>
+        <w:tc>
+          <w:tcPr>
+            <w:tcW w:type="dxa" w:w="6480"/>
+          </w:tcPr>
+          <w:p>
+            <w:r/>
+            <w:r>
+              <w:rPr>
+                <w:b w:val="0"/>
+              </w:rPr>
+              <w:t>from sklearn.datasets import load_iris</w:t>
+            </w:r>
+          </w:p>
+        </w:tc>
+      </w:tr>
+      <w:tr>
+        <w:tc>
+          <w:tcPr>
+            <w:tcW w:type="dxa" w:w="2880"/>
+          </w:tcPr>
+          <w:p>
+            <w:r/>
+            <w:r>
+              <w:rPr>
+                <w:b w:val="0"/>
+              </w:rPr>
+              <w:t>Breast cancer data</w:t>
+            </w:r>
+          </w:p>
+        </w:tc>
+        <w:tc>
+          <w:tcPr>
+            <w:tcW w:type="dxa" w:w="6480"/>
+          </w:tcPr>
+          <w:p>
+            <w:r/>
+            <w:r>
+              <w:rPr>
+                <w:b w:val="0"/>
+              </w:rPr>
+              <w:t>from sklearn.datasets import load_breast_cancer</w:t>
+            </w:r>
+          </w:p>
+        </w:tc>
+      </w:tr>
+      <w:tr>
+        <w:tc>
+          <w:tcPr>
+            <w:tcW w:type="dxa" w:w="2880"/>
+          </w:tcPr>
+          <w:p>
+            <w:r/>
+            <w:r>
+              <w:rPr>
+                <w:b w:val="0"/>
+              </w:rPr>
+              <w:t>Train/test split</w:t>
+            </w:r>
+          </w:p>
+        </w:tc>
+        <w:tc>
+          <w:tcPr>
+            <w:tcW w:type="dxa" w:w="6480"/>
+          </w:tcPr>
+          <w:p>
+            <w:r/>
+            <w:r>
+              <w:rPr>
+                <w:b w:val="0"/>
+              </w:rPr>
+              <w:t>from sklearn.model_selection import train_test_split</w:t>
+            </w:r>
+          </w:p>
+        </w:tc>
+      </w:tr>
+      <w:tr>
+        <w:tc>
+          <w:tcPr>
+            <w:tcW w:type="dxa" w:w="2880"/>
+          </w:tcPr>
+          <w:p>
+            <w:r/>
+            <w:r>
+              <w:rPr>
+                <w:b w:val="0"/>
+              </w:rPr>
+              <w:t>k-NN classifier</w:t>
+            </w:r>
+          </w:p>
+        </w:tc>
+        <w:tc>
+          <w:tcPr>
+            <w:tcW w:type="dxa" w:w="6480"/>
+          </w:tcPr>
+          <w:p>
+            <w:r/>
+            <w:r>
+              <w:rPr>
+                <w:b w:val="0"/>
+              </w:rPr>
+              <w:t>from sklearn.neighbors import KNeighborsClassifier</w:t>
+            </w:r>
+          </w:p>
+        </w:tc>
+      </w:tr>
+      <w:tr>
+        <w:tc>
+          <w:tcPr>
+            <w:tcW w:type="dxa" w:w="2880"/>
+          </w:tcPr>
+          <w:p>
+            <w:r/>
+            <w:r>
+              <w:rPr>
+                <w:b w:val="0"/>
+              </w:rPr>
+              <w:t>Accuracy</w:t>
+            </w:r>
+          </w:p>
+        </w:tc>
+        <w:tc>
+          <w:tcPr>
+            <w:tcW w:type="dxa" w:w="6480"/>
+          </w:tcPr>
+          <w:p>
+            <w:r/>
+            <w:r>
+              <w:rPr>
+                <w:b w:val="0"/>
+              </w:rPr>
+              <w:t>from sklearn.metrics import accuracy_score</w:t>
+            </w:r>
+          </w:p>
+        </w:tc>
+      </w:tr>
+      <w:tr>
+        <w:tc>
+          <w:tcPr>
+            <w:tcW w:type="dxa" w:w="2880"/>
+          </w:tcPr>
+          <w:p>
+            <w:r/>
+            <w:r>
+              <w:rPr>
+                <w:b w:val="0"/>
+              </w:rPr>
+              <w:t>Missing-value imputer</w:t>
+            </w:r>
+          </w:p>
+        </w:tc>
+        <w:tc>
+          <w:tcPr>
+            <w:tcW w:type="dxa" w:w="6480"/>
+          </w:tcPr>
+          <w:p>
+            <w:r/>
+            <w:r>
+              <w:rPr>
+                <w:b w:val="0"/>
+              </w:rPr>
+              <w:t>from sklearn.impute import SimpleImputer</w:t>
+            </w:r>
+          </w:p>
+        </w:tc>
+      </w:tr>
+      <w:tr>
+        <w:tc>
+          <w:tcPr>
+            <w:tcW w:type="dxa" w:w="2880"/>
+          </w:tcPr>
+          <w:p>
+            <w:r/>
+            <w:r>
+              <w:rPr>
+                <w:b w:val="0"/>
+              </w:rPr>
+              <w:t>Z-score scaling</w:t>
+            </w:r>
+          </w:p>
+        </w:tc>
+        <w:tc>
+          <w:tcPr>
+            <w:tcW w:type="dxa" w:w="6480"/>
+          </w:tcPr>
+          <w:p>
+            <w:r/>
+            <w:r>
+              <w:rPr>
+                <w:b w:val="0"/>
+              </w:rPr>
+              <w:t>from sklearn.preprocessing import StandardScaler</w:t>
+            </w:r>
+          </w:p>
+        </w:tc>
+      </w:tr>
+      <w:tr>
+        <w:tc>
+          <w:tcPr>
+            <w:tcW w:type="dxa" w:w="2880"/>
+          </w:tcPr>
+          <w:p>
+            <w:r/>
+            <w:r>
+              <w:rPr>
+                <w:b w:val="0"/>
+              </w:rPr>
+              <w:t>0 to 1 scaling</w:t>
+            </w:r>
+          </w:p>
+        </w:tc>
+        <w:tc>
+          <w:tcPr>
+            <w:tcW w:type="dxa" w:w="6480"/>
+          </w:tcPr>
+          <w:p>
+            <w:r/>
+            <w:r>
+              <w:rPr>
+                <w:b w:val="0"/>
+              </w:rPr>
+              <w:t>from sklearn.preprocessing import MinMaxScaler</w:t>
+            </w:r>
+          </w:p>
+        </w:tc>
+      </w:tr>
+    </w:tbl>
+    <w:p>
+      <w:pPr>
+        <w:spacing w:after="40"/>
+      </w:pPr>
+    </w:p>
+    <w:tbl>
+      <w:tblPr>
+        <w:tblStyle w:val="TableGrid"/>
+        <w:tblW w:type="auto" w:w="0"/>
+        <w:tblLook w:firstColumn="1" w:firstRow="1" w:lastColumn="0" w:lastRow="0" w:noHBand="0" w:noVBand="1" w:val="04A0"/>
+      </w:tblPr>
+      <w:tblGrid>
+        <w:gridCol w:w="9360"/>
+      </w:tblGrid>
+      <w:tr>
+        <w:tc>
+          <w:tcPr>
+            <w:tcW w:type="dxa" w:w="9360"/>
+            <w:shd w:val="clear" w:color="auto" w:fill="E8F0FE"/>
+          </w:tcPr>
+          <w:p>
+            <w:r/>
+            <w:r>
+              <w:rPr>
+                <w:b/>
+              </w:rPr>
+              <w:t>Memory Aid</w:t>
+            </w:r>
+          </w:p>
+          <w:p>
+            <w:r>
+              <w:rPr>
+                <w:b w:val="0"/>
+              </w:rPr>
+              <w:t xml:space="preserve">Package = what it does: </w:t>
+            </w:r>
+            <w:r>
+              <w:rPr>
+                <w:b/>
+              </w:rPr>
+              <w:t>datasets</w:t>
+            </w:r>
+            <w:r>
+              <w:rPr>
+                <w:b w:val="0"/>
+              </w:rPr>
+              <w:t xml:space="preserve">, </w:t>
+            </w:r>
+            <w:r>
+              <w:rPr>
+                <w:b/>
+              </w:rPr>
+              <w:t>model_selection</w:t>
+            </w:r>
+            <w:r>
+              <w:rPr>
+                <w:b w:val="0"/>
+              </w:rPr>
+              <w:t xml:space="preserve"> (splitting), </w:t>
+            </w:r>
+            <w:r>
+              <w:rPr>
+                <w:b/>
+              </w:rPr>
+              <w:t>neighbors</w:t>
+            </w:r>
+            <w:r>
+              <w:rPr>
+                <w:b w:val="0"/>
+              </w:rPr>
+              <w:t xml:space="preserve">, </w:t>
+            </w:r>
+            <w:r>
+              <w:rPr>
+                <w:b/>
+              </w:rPr>
+              <w:t>impute</w:t>
+            </w:r>
+            <w:r>
+              <w:rPr>
+                <w:b w:val="0"/>
+              </w:rPr>
+              <w:t xml:space="preserve">, </w:t>
+            </w:r>
+            <w:r>
+              <w:rPr>
+                <w:b/>
+              </w:rPr>
+              <w:t>preprocessing</w:t>
+            </w:r>
+            <w:r>
+              <w:rPr>
+                <w:b w:val="0"/>
+              </w:rPr>
+              <w:t xml:space="preserve"> (scalers), </w:t>
+            </w:r>
+            <w:r>
+              <w:rPr>
+                <w:b/>
+              </w:rPr>
+              <w:t>metrics</w:t>
+            </w:r>
+            <w:r>
+              <w:rPr>
+                <w:b w:val="0"/>
+              </w:rPr>
+              <w:t>. The class name is the one with capitals.</w:t>
+            </w:r>
+          </w:p>
+        </w:tc>
+      </w:tr>
+    </w:tbl>
+    <w:p>
+      <w:pPr>
+        <w:spacing w:after="40"/>
+      </w:pPr>
+    </w:p>
+    <w:p>
+      <w:pPr>
+        <w:spacing w:after="120"/>
+      </w:pPr>
+      <w:r>
+        <w:rPr>
+          <w:b w:val="0"/>
+        </w:rPr>
+        <w:t>Standard scikit-learn paths for the other algorithms (not in the module notebooks, so lower odds): sklearn.linear_model (LinearRegression, Ridge, Lasso, LogisticRegression), sklearn.naive_bayes (GaussianNB), sklearn.tree (DecisionTreeClassifier), sklearn.ensemble (RandomForestClassifier, GradientBoostingClassifier), sklearn.svm (SVC, LinearSVC).</w:t>
+      </w:r>
+    </w:p>
+    <w:p>
+      <w:pPr>
+        <w:pStyle w:val="Heading2"/>
+      </w:pPr>
+      <w:r>
+        <w:t>Code 1. k-NN On Iris (Most Likely 7-Point Item)</w:t>
+      </w:r>
+    </w:p>
+    <w:tbl>
+      <w:tblPr>
+        <w:tblStyle w:val="TableGrid"/>
+        <w:tblW w:type="auto" w:w="0"/>
+        <w:tblLook w:firstColumn="1" w:firstRow="1" w:lastColumn="0" w:lastRow="0" w:noHBand="0" w:noVBand="1" w:val="04A0"/>
+      </w:tblPr>
+      <w:tblGrid>
+        <w:gridCol w:w="9360"/>
+      </w:tblGrid>
+      <w:tr>
+        <w:tc>
+          <w:tcPr>
+            <w:tcW w:type="dxa" w:w="9360"/>
+            <w:shd w:val="clear" w:color="auto" w:fill="F5F5F5"/>
+          </w:tcPr>
+          <w:p>
+            <w:r/>
+            <w:r>
+              <w:rPr>
+                <w:b/>
+              </w:rPr>
+              <w:t>Load, split, build, train, predict, score</w:t>
+            </w:r>
+          </w:p>
+          <w:p>
+            <w:pPr>
+              <w:spacing w:after="0"/>
+            </w:pPr>
+            <w:r>
+              <w:rPr>
+                <w:rFonts w:ascii="Consolas" w:hAnsi="Consolas"/>
+                <w:sz w:val="20"/>
+              </w:rPr>
+              <w:t>from sklearn.datasets import load_iris</w:t>
+            </w:r>
+          </w:p>
+          <w:p>
+            <w:pPr>
+              <w:spacing w:after="0"/>
+            </w:pPr>
+            <w:r>
+              <w:rPr>
+                <w:rFonts w:ascii="Consolas" w:hAnsi="Consolas"/>
+                <w:sz w:val="20"/>
+              </w:rPr>
+              <w:t>iris_dataset = load_iris()</w:t>
+            </w:r>
+          </w:p>
+          <w:p>
+            <w:pPr>
+              <w:spacing w:after="0"/>
+            </w:pPr>
+            <w:r>
+              <w:rPr>
+                <w:rFonts w:ascii="Consolas" w:hAnsi="Consolas"/>
+                <w:sz w:val="20"/>
+              </w:rPr>
+            </w:r>
+          </w:p>
+          <w:p>
+            <w:pPr>
+              <w:spacing w:after="0"/>
+            </w:pPr>
+            <w:r>
+              <w:rPr>
+                <w:rFonts w:ascii="Consolas" w:hAnsi="Consolas"/>
+                <w:sz w:val="20"/>
+              </w:rPr>
+              <w:t>from sklearn.model_selection import train_test_split</w:t>
+            </w:r>
+          </w:p>
+          <w:p>
+            <w:pPr>
+              <w:spacing w:after="0"/>
+            </w:pPr>
+            <w:r>
+              <w:rPr>
+                <w:rFonts w:ascii="Consolas" w:hAnsi="Consolas"/>
+                <w:sz w:val="20"/>
+              </w:rPr>
+              <w:t>X_train, X_test, y_train, y_test = train_test_split(</w:t>
+            </w:r>
+          </w:p>
+          <w:p>
+            <w:pPr>
+              <w:spacing w:after="0"/>
+            </w:pPr>
+            <w:r>
+              <w:rPr>
+                <w:rFonts w:ascii="Consolas" w:hAnsi="Consolas"/>
+                <w:sz w:val="20"/>
+              </w:rPr>
+              <w:t xml:space="preserve">    iris_dataset['data'], iris_dataset['target'], random_state=0)</w:t>
+            </w:r>
+          </w:p>
+          <w:p>
+            <w:pPr>
+              <w:spacing w:after="0"/>
+            </w:pPr>
+            <w:r>
+              <w:rPr>
+                <w:rFonts w:ascii="Consolas" w:hAnsi="Consolas"/>
+                <w:sz w:val="20"/>
+              </w:rPr>
+            </w:r>
+          </w:p>
+          <w:p>
+            <w:pPr>
+              <w:spacing w:after="0"/>
+            </w:pPr>
+            <w:r>
+              <w:rPr>
+                <w:rFonts w:ascii="Consolas" w:hAnsi="Consolas"/>
+                <w:sz w:val="20"/>
+              </w:rPr>
+              <w:t>from sklearn.neighbors import KNeighborsClassifier</w:t>
+            </w:r>
+          </w:p>
+          <w:p>
+            <w:pPr>
+              <w:spacing w:after="0"/>
+            </w:pPr>
+            <w:r>
+              <w:rPr>
+                <w:rFonts w:ascii="Consolas" w:hAnsi="Consolas"/>
+                <w:sz w:val="20"/>
+              </w:rPr>
+              <w:t>knn = KNeighborsClassifier(n_neighbors=3)</w:t>
+            </w:r>
+          </w:p>
+          <w:p>
+            <w:pPr>
+              <w:spacing w:after="0"/>
+            </w:pPr>
+            <w:r>
+              <w:rPr>
+                <w:rFonts w:ascii="Consolas" w:hAnsi="Consolas"/>
+                <w:sz w:val="20"/>
+              </w:rPr>
+              <w:t>knn.fit(X_train, y_train)</w:t>
+            </w:r>
+          </w:p>
+          <w:p>
+            <w:pPr>
+              <w:spacing w:after="0"/>
+            </w:pPr>
+            <w:r>
+              <w:rPr>
+                <w:rFonts w:ascii="Consolas" w:hAnsi="Consolas"/>
+                <w:sz w:val="20"/>
+              </w:rPr>
+            </w:r>
+          </w:p>
+          <w:p>
+            <w:pPr>
+              <w:spacing w:after="0"/>
+            </w:pPr>
+            <w:r>
+              <w:rPr>
+                <w:rFonts w:ascii="Consolas" w:hAnsi="Consolas"/>
+                <w:sz w:val="20"/>
+              </w:rPr>
+              <w:t>y_pred = knn.predict(X_test)</w:t>
+            </w:r>
+          </w:p>
+          <w:p>
+            <w:pPr>
+              <w:spacing w:after="0"/>
+            </w:pPr>
+            <w:r>
+              <w:rPr>
+                <w:rFonts w:ascii="Consolas" w:hAnsi="Consolas"/>
+                <w:sz w:val="20"/>
+              </w:rPr>
+              <w:t>print("Test set score: {:.2f}".format(knn.score(X_test, y_test)))</w:t>
+            </w:r>
+          </w:p>
+          <w:p>
+            <w:pPr>
+              <w:spacing w:after="0"/>
+            </w:pPr>
+            <w:r>
+              <w:rPr>
+                <w:rFonts w:ascii="Consolas" w:hAnsi="Consolas"/>
+                <w:sz w:val="20"/>
+              </w:rPr>
+              <w:t>print("Test set score: {:.2f}".format(np.mean(y_pred == y_test)))   # same number by hand</w:t>
+            </w:r>
+          </w:p>
+          <w:p>
+            <w:pPr>
+              <w:spacing w:after="0"/>
+            </w:pPr>
+            <w:r>
+              <w:rPr>
+                <w:rFonts w:ascii="Consolas" w:hAnsi="Consolas"/>
+                <w:sz w:val="20"/>
+              </w:rPr>
+            </w:r>
+          </w:p>
+          <w:p>
+            <w:pPr>
+              <w:spacing w:after="0"/>
+            </w:pPr>
+            <w:r>
+              <w:rPr>
+                <w:rFonts w:ascii="Consolas" w:hAnsi="Consolas"/>
+                <w:sz w:val="20"/>
+              </w:rPr>
+              <w:t>X_new = np.array([[40, 80, 70, 30]])</w:t>
+            </w:r>
+          </w:p>
+          <w:p>
+            <w:pPr>
+              <w:spacing w:after="0"/>
+            </w:pPr>
+            <w:r>
+              <w:rPr>
+                <w:rFonts w:ascii="Consolas" w:hAnsi="Consolas"/>
+                <w:sz w:val="20"/>
+              </w:rPr>
+              <w:t>prediction = knn.predict(X_new)</w:t>
+            </w:r>
+          </w:p>
+          <w:p>
+            <w:pPr>
+              <w:spacing w:after="0"/>
+            </w:pPr>
+            <w:r>
+              <w:rPr>
+                <w:rFonts w:ascii="Consolas" w:hAnsi="Consolas"/>
+                <w:sz w:val="20"/>
+              </w:rPr>
+              <w:t>print("Predicted target name:", iris_dataset['target_names'][prediction])</w:t>
+            </w:r>
+          </w:p>
+        </w:tc>
+      </w:tr>
+    </w:tbl>
+    <w:p>
+      <w:pPr>
+        <w:spacing w:after="40"/>
+      </w:pPr>
+    </w:p>
+    <w:p>
+      <w:pPr>
+        <w:pStyle w:val="ListBullet"/>
+      </w:pPr>
+      <w:r>
+        <w:rPr>
+          <w:b w:val="0"/>
+        </w:rPr>
+        <w:t xml:space="preserve">Order to remember: </w:t>
+      </w:r>
+      <w:r>
+        <w:rPr>
+          <w:b/>
+        </w:rPr>
+        <w:t>load, split, instantiate with n_neighbors, fit, predict, score</w:t>
+      </w:r>
+      <w:r>
+        <w:rPr>
+          <w:b w:val="0"/>
+        </w:rPr>
+        <w:t>.</w:t>
+      </w:r>
+    </w:p>
+    <w:p>
+      <w:pPr>
+        <w:pStyle w:val="ListBullet"/>
+      </w:pPr>
+      <w:r>
+        <w:rPr>
+          <w:b w:val="0"/>
+        </w:rPr>
+        <w:t>fit(X_train, y_train) trains. predict(X_test) gives labels. score(X_test, y_test) gives accuracy.</w:t>
+      </w:r>
+    </w:p>
+    <w:p>
+      <w:pPr>
+        <w:pStyle w:val="ListBullet"/>
+      </w:pPr>
+      <w:r>
+        <w:rPr>
+          <w:b w:val="0"/>
+        </w:rPr>
+        <w:t xml:space="preserve">X_new must be </w:t>
+      </w:r>
+      <w:r>
+        <w:rPr>
+          <w:b/>
+        </w:rPr>
+        <w:t>2-D</w:t>
+      </w:r>
+      <w:r>
+        <w:rPr>
+          <w:b w:val="0"/>
+        </w:rPr>
+        <w:t>, so it is a list inside a list: np.array([[40, 80, 70, 30]]).</w:t>
+      </w:r>
+    </w:p>
+    <w:p>
+      <w:pPr>
+        <w:pStyle w:val="ListBullet"/>
+      </w:pPr>
+      <w:r>
+        <w:rPr>
+          <w:b w:val="0"/>
+        </w:rPr>
+        <w:t>Look at the data with iris_dataset.keys(), ['target_names'], ['feature_names'], ['data'].shape, X_train.shape.</w:t>
+      </w:r>
+    </w:p>
+    <w:p>
+      <w:pPr>
+        <w:pStyle w:val="Heading2"/>
+      </w:pPr>
+      <w:r>
+        <w:t>Code 2. k-NN On Breast Cancer, With The Complexity Curve</w:t>
+      </w:r>
+    </w:p>
+    <w:tbl>
+      <w:tblPr>
+        <w:tblStyle w:val="TableGrid"/>
+        <w:tblW w:type="auto" w:w="0"/>
+        <w:tblLook w:firstColumn="1" w:firstRow="1" w:lastColumn="0" w:lastRow="0" w:noHBand="0" w:noVBand="1" w:val="04A0"/>
+      </w:tblPr>
+      <w:tblGrid>
+        <w:gridCol w:w="9360"/>
+      </w:tblGrid>
+      <w:tr>
+        <w:tc>
+          <w:tcPr>
+            <w:tcW w:type="dxa" w:w="9360"/>
+            <w:shd w:val="clear" w:color="auto" w:fill="F5F5F5"/>
+          </w:tcPr>
+          <w:p>
+            <w:r/>
+            <w:r>
+              <w:rPr>
+                <w:b/>
+              </w:rPr>
+              <w:t>DataFrame, stratified split, loop over k</w:t>
+            </w:r>
+          </w:p>
+          <w:p>
+            <w:pPr>
+              <w:spacing w:after="0"/>
+            </w:pPr>
+            <w:r>
+              <w:rPr>
+                <w:rFonts w:ascii="Consolas" w:hAnsi="Consolas"/>
+                <w:sz w:val="20"/>
+              </w:rPr>
+              <w:t>from sklearn.datasets import load_breast_cancer</w:t>
+            </w:r>
+          </w:p>
+          <w:p>
+            <w:pPr>
+              <w:spacing w:after="0"/>
+            </w:pPr>
+            <w:r>
+              <w:rPr>
+                <w:rFonts w:ascii="Consolas" w:hAnsi="Consolas"/>
+                <w:sz w:val="20"/>
+              </w:rPr>
+              <w:t>cancer = load_breast_cancer()</w:t>
+            </w:r>
+          </w:p>
+          <w:p>
+            <w:pPr>
+              <w:spacing w:after="0"/>
+            </w:pPr>
+            <w:r>
+              <w:rPr>
+                <w:rFonts w:ascii="Consolas" w:hAnsi="Consolas"/>
+                <w:sz w:val="20"/>
+              </w:rPr>
+            </w:r>
+          </w:p>
+          <w:p>
+            <w:pPr>
+              <w:spacing w:after="0"/>
+            </w:pPr>
+            <w:r>
+              <w:rPr>
+                <w:rFonts w:ascii="Consolas" w:hAnsi="Consolas"/>
+                <w:sz w:val="20"/>
+              </w:rPr>
+              <w:t>df = pd.DataFrame(data=cancer.data, columns=cancer.feature_names)</w:t>
+            </w:r>
+          </w:p>
+          <w:p>
+            <w:pPr>
+              <w:spacing w:after="0"/>
+            </w:pPr>
+            <w:r>
+              <w:rPr>
+                <w:rFonts w:ascii="Consolas" w:hAnsi="Consolas"/>
+                <w:sz w:val="20"/>
+              </w:rPr>
+              <w:t>df['target'] = cancer.target</w:t>
+            </w:r>
+          </w:p>
+          <w:p>
+            <w:pPr>
+              <w:spacing w:after="0"/>
+            </w:pPr>
+            <w:r>
+              <w:rPr>
+                <w:rFonts w:ascii="Consolas" w:hAnsi="Consolas"/>
+                <w:sz w:val="20"/>
+              </w:rPr>
+            </w:r>
+          </w:p>
+          <w:p>
+            <w:pPr>
+              <w:spacing w:after="0"/>
+            </w:pPr>
+            <w:r>
+              <w:rPr>
+                <w:rFonts w:ascii="Consolas" w:hAnsi="Consolas"/>
+                <w:sz w:val="20"/>
+              </w:rPr>
+              <w:t>X = df.drop(columns='target')      # features</w:t>
+            </w:r>
+          </w:p>
+          <w:p>
+            <w:pPr>
+              <w:spacing w:after="0"/>
+            </w:pPr>
+            <w:r>
+              <w:rPr>
+                <w:rFonts w:ascii="Consolas" w:hAnsi="Consolas"/>
+                <w:sz w:val="20"/>
+              </w:rPr>
+              <w:t>y = df['target']                   # target</w:t>
+            </w:r>
+          </w:p>
+          <w:p>
+            <w:pPr>
+              <w:spacing w:after="0"/>
+            </w:pPr>
+            <w:r>
+              <w:rPr>
+                <w:rFonts w:ascii="Consolas" w:hAnsi="Consolas"/>
+                <w:sz w:val="20"/>
+              </w:rPr>
+              <w:t>X_train, X_test, y_train, y_test = train_test_split(X, y, stratify=y, random_state=66)</w:t>
+            </w:r>
+          </w:p>
+          <w:p>
+            <w:pPr>
+              <w:spacing w:after="0"/>
+            </w:pPr>
+            <w:r>
+              <w:rPr>
+                <w:rFonts w:ascii="Consolas" w:hAnsi="Consolas"/>
+                <w:sz w:val="20"/>
+              </w:rPr>
+            </w:r>
+          </w:p>
+          <w:p>
+            <w:pPr>
+              <w:spacing w:after="0"/>
+            </w:pPr>
+            <w:r>
+              <w:rPr>
+                <w:rFonts w:ascii="Consolas" w:hAnsi="Consolas"/>
+                <w:sz w:val="20"/>
+              </w:rPr>
+              <w:t>training_accuracy = []</w:t>
+            </w:r>
+          </w:p>
+          <w:p>
+            <w:pPr>
+              <w:spacing w:after="0"/>
+            </w:pPr>
+            <w:r>
+              <w:rPr>
+                <w:rFonts w:ascii="Consolas" w:hAnsi="Consolas"/>
+                <w:sz w:val="20"/>
+              </w:rPr>
+              <w:t>test_accuracy = []</w:t>
+            </w:r>
+          </w:p>
+          <w:p>
+            <w:pPr>
+              <w:spacing w:after="0"/>
+            </w:pPr>
+            <w:r>
+              <w:rPr>
+                <w:rFonts w:ascii="Consolas" w:hAnsi="Consolas"/>
+                <w:sz w:val="20"/>
+              </w:rPr>
+              <w:t>neighbors_settings = range(1, 10)</w:t>
+            </w:r>
+          </w:p>
+          <w:p>
+            <w:pPr>
+              <w:spacing w:after="0"/>
+            </w:pPr>
+            <w:r>
+              <w:rPr>
+                <w:rFonts w:ascii="Consolas" w:hAnsi="Consolas"/>
+                <w:sz w:val="20"/>
+              </w:rPr>
+              <w:t>for n_neighbors in neighbors_settings:</w:t>
+            </w:r>
+          </w:p>
+          <w:p>
+            <w:pPr>
+              <w:spacing w:after="0"/>
+            </w:pPr>
+            <w:r>
+              <w:rPr>
+                <w:rFonts w:ascii="Consolas" w:hAnsi="Consolas"/>
+                <w:sz w:val="20"/>
+              </w:rPr>
+              <w:t xml:space="preserve">    knn = KNeighborsClassifier(n_neighbors=n_neighbors)</w:t>
+            </w:r>
+          </w:p>
+          <w:p>
+            <w:pPr>
+              <w:spacing w:after="0"/>
+            </w:pPr>
+            <w:r>
+              <w:rPr>
+                <w:rFonts w:ascii="Consolas" w:hAnsi="Consolas"/>
+                <w:sz w:val="20"/>
+              </w:rPr>
+              <w:t xml:space="preserve">    knn.fit(X_train, y_train)</w:t>
+            </w:r>
+          </w:p>
+          <w:p>
+            <w:pPr>
+              <w:spacing w:after="0"/>
+            </w:pPr>
+            <w:r>
+              <w:rPr>
+                <w:rFonts w:ascii="Consolas" w:hAnsi="Consolas"/>
+                <w:sz w:val="20"/>
+              </w:rPr>
+              <w:t xml:space="preserve">    training_accuracy.append(knn.score(X_train, y_train))</w:t>
+            </w:r>
+          </w:p>
+          <w:p>
+            <w:pPr>
+              <w:spacing w:after="0"/>
+            </w:pPr>
+            <w:r>
+              <w:rPr>
+                <w:rFonts w:ascii="Consolas" w:hAnsi="Consolas"/>
+                <w:sz w:val="20"/>
+              </w:rPr>
+              <w:t xml:space="preserve">    test_accuracy.append(knn.score(X_test, y_test))</w:t>
+            </w:r>
+          </w:p>
+          <w:p>
+            <w:pPr>
+              <w:spacing w:after="0"/>
+            </w:pPr>
+            <w:r>
+              <w:rPr>
+                <w:rFonts w:ascii="Consolas" w:hAnsi="Consolas"/>
+                <w:sz w:val="20"/>
+              </w:rPr>
+              <w:t>plt.plot(neighbors_settings, training_accuracy, label="training accuracy")</w:t>
+            </w:r>
+          </w:p>
+          <w:p>
+            <w:pPr>
+              <w:spacing w:after="0"/>
+            </w:pPr>
+            <w:r>
+              <w:rPr>
+                <w:rFonts w:ascii="Consolas" w:hAnsi="Consolas"/>
+                <w:sz w:val="20"/>
+              </w:rPr>
+              <w:t>plt.plot(neighbors_settings, test_accuracy, label="test accuracy")</w:t>
+            </w:r>
+          </w:p>
+          <w:p>
+            <w:pPr>
+              <w:spacing w:after="0"/>
+            </w:pPr>
+            <w:r>
+              <w:rPr>
+                <w:rFonts w:ascii="Consolas" w:hAnsi="Consolas"/>
+                <w:sz w:val="20"/>
+              </w:rPr>
+              <w:t>plt.ylabel("Accuracy")</w:t>
+            </w:r>
+          </w:p>
+          <w:p>
+            <w:pPr>
+              <w:spacing w:after="0"/>
+            </w:pPr>
+            <w:r>
+              <w:rPr>
+                <w:rFonts w:ascii="Consolas" w:hAnsi="Consolas"/>
+                <w:sz w:val="20"/>
+              </w:rPr>
+              <w:t>plt.xlabel("n_neighbors")</w:t>
+            </w:r>
+          </w:p>
+          <w:p>
+            <w:pPr>
+              <w:spacing w:after="0"/>
+            </w:pPr>
+            <w:r>
+              <w:rPr>
+                <w:rFonts w:ascii="Consolas" w:hAnsi="Consolas"/>
+                <w:sz w:val="20"/>
+              </w:rPr>
+              <w:t>plt.legend()</w:t>
+            </w:r>
+          </w:p>
+          <w:p>
+            <w:pPr>
+              <w:spacing w:after="0"/>
+            </w:pPr>
+            <w:r>
+              <w:rPr>
+                <w:rFonts w:ascii="Consolas" w:hAnsi="Consolas"/>
+                <w:sz w:val="20"/>
+              </w:rPr>
+            </w:r>
+          </w:p>
+          <w:p>
+            <w:pPr>
+              <w:spacing w:after="0"/>
+            </w:pPr>
+            <w:r>
+              <w:rPr>
+                <w:rFonts w:ascii="Consolas" w:hAnsi="Consolas"/>
+                <w:sz w:val="20"/>
+              </w:rPr>
+              <w:t>knn = KNeighborsClassifier(n_neighbors=6)   # k picked from the curve</w:t>
+            </w:r>
+          </w:p>
+          <w:p>
+            <w:pPr>
+              <w:spacing w:after="0"/>
+            </w:pPr>
+            <w:r>
+              <w:rPr>
+                <w:rFonts w:ascii="Consolas" w:hAnsi="Consolas"/>
+                <w:sz w:val="20"/>
+              </w:rPr>
+              <w:t>knn.fit(X_train, y_train)</w:t>
+            </w:r>
+          </w:p>
+        </w:tc>
+      </w:tr>
+    </w:tbl>
+    <w:p>
+      <w:pPr>
+        <w:spacing w:after="40"/>
+      </w:pPr>
+    </w:p>
+    <w:p>
+      <w:pPr>
+        <w:pStyle w:val="ListBullet"/>
+      </w:pPr>
+      <w:r>
+        <w:rPr>
+          <w:b w:val="0"/>
+        </w:rPr>
+        <w:t xml:space="preserve">stratify=y keeps the </w:t>
+      </w:r>
+      <w:r>
+        <w:rPr>
+          <w:b/>
+        </w:rPr>
+        <w:t>class proportions</w:t>
+      </w:r>
+      <w:r>
+        <w:rPr>
+          <w:b w:val="0"/>
+        </w:rPr>
+        <w:t xml:space="preserve"> the same in train and test. random_state makes the split repeatable.</w:t>
+      </w:r>
+    </w:p>
+    <w:p>
+      <w:pPr>
+        <w:pStyle w:val="ListBullet"/>
+      </w:pPr>
+      <w:r>
+        <w:rPr>
+          <w:b w:val="0"/>
+        </w:rPr>
+        <w:t xml:space="preserve">Cancer data: </w:t>
+      </w:r>
+      <w:r>
+        <w:rPr>
+          <w:b/>
+        </w:rPr>
+        <w:t>569 samples, 212 malignant and 357 benign</w:t>
+      </w:r>
+      <w:r>
+        <w:rPr>
+          <w:b w:val="0"/>
+        </w:rPr>
+        <w:t>, 30 features. Iris used random_state=0 and n_neighbors=3; cancer used random_state=66 and n_neighbors=6.</w:t>
+      </w:r>
+    </w:p>
+    <w:p>
+      <w:pPr>
+        <w:pStyle w:val="ListBullet"/>
+      </w:pPr>
+      <w:r>
+        <w:rPr>
+          <w:b w:val="0"/>
+        </w:rPr>
+        <w:t>Pattern: empty lists, a for loop over k, .append(knn.score(...)), then plt.plot both lists against k.</w:t>
+      </w:r>
+    </w:p>
+    <w:p>
+      <w:pPr>
+        <w:pStyle w:val="Heading2"/>
+      </w:pPr>
+      <w:r>
+        <w:t>Code 3. Module 1 Preprocessing (Also On SA1)</w:t>
+      </w:r>
+    </w:p>
+    <w:tbl>
+      <w:tblPr>
+        <w:tblStyle w:val="TableGrid"/>
+        <w:tblW w:type="auto" w:w="0"/>
+        <w:tblLook w:firstColumn="1" w:firstRow="1" w:lastColumn="0" w:lastRow="0" w:noHBand="0" w:noVBand="1" w:val="04A0"/>
+      </w:tblPr>
+      <w:tblGrid>
+        <w:gridCol w:w="9360"/>
+      </w:tblGrid>
+      <w:tr>
+        <w:tc>
+          <w:tcPr>
+            <w:tcW w:type="dxa" w:w="9360"/>
+            <w:shd w:val="clear" w:color="auto" w:fill="F5F5F5"/>
+          </w:tcPr>
+          <w:p>
+            <w:r/>
+            <w:r>
+              <w:rPr>
+                <w:b/>
+              </w:rPr>
+              <w:t>Imputation and scaling</w:t>
+            </w:r>
+          </w:p>
+          <w:p>
+            <w:pPr>
+              <w:spacing w:after="0"/>
+            </w:pPr>
+            <w:r>
+              <w:rPr>
+                <w:rFonts w:ascii="Consolas" w:hAnsi="Consolas"/>
+                <w:sz w:val="20"/>
+              </w:rPr>
+              <w:t>import numpy as np</w:t>
+            </w:r>
+          </w:p>
+          <w:p>
+            <w:pPr>
+              <w:spacing w:after="0"/>
+            </w:pPr>
+            <w:r>
+              <w:rPr>
+                <w:rFonts w:ascii="Consolas" w:hAnsi="Consolas"/>
+                <w:sz w:val="20"/>
+              </w:rPr>
+              <w:t>import pandas as pd</w:t>
+            </w:r>
+          </w:p>
+          <w:p>
+            <w:pPr>
+              <w:spacing w:after="0"/>
+            </w:pPr>
+            <w:r>
+              <w:rPr>
+                <w:rFonts w:ascii="Consolas" w:hAnsi="Consolas"/>
+                <w:sz w:val="20"/>
+              </w:rPr>
+              <w:t>import matplotlib.pyplot as plt</w:t>
+            </w:r>
+          </w:p>
+          <w:p>
+            <w:pPr>
+              <w:spacing w:after="0"/>
+            </w:pPr>
+            <w:r>
+              <w:rPr>
+                <w:rFonts w:ascii="Consolas" w:hAnsi="Consolas"/>
+                <w:sz w:val="20"/>
+              </w:rPr>
+              <w:t>from sklearn.impute import SimpleImputer</w:t>
+            </w:r>
+          </w:p>
+          <w:p>
+            <w:pPr>
+              <w:spacing w:after="0"/>
+            </w:pPr>
+            <w:r>
+              <w:rPr>
+                <w:rFonts w:ascii="Consolas" w:hAnsi="Consolas"/>
+                <w:sz w:val="20"/>
+              </w:rPr>
+            </w:r>
+          </w:p>
+          <w:p>
+            <w:pPr>
+              <w:spacing w:after="0"/>
+            </w:pPr>
+            <w:r>
+              <w:rPr>
+                <w:rFonts w:ascii="Consolas" w:hAnsi="Consolas"/>
+                <w:sz w:val="20"/>
+              </w:rPr>
+              <w:t>df = pd.read_csv('diabetes_NaN_age 3.csv')</w:t>
+            </w:r>
+          </w:p>
+          <w:p>
+            <w:pPr>
+              <w:spacing w:after="0"/>
+            </w:pPr>
+            <w:r>
+              <w:rPr>
+                <w:rFonts w:ascii="Consolas" w:hAnsi="Consolas"/>
+                <w:sz w:val="20"/>
+              </w:rPr>
+            </w:r>
+          </w:p>
+          <w:p>
+            <w:pPr>
+              <w:spacing w:after="0"/>
+            </w:pPr>
+            <w:r>
+              <w:rPr>
+                <w:rFonts w:ascii="Consolas" w:hAnsi="Consolas"/>
+                <w:sz w:val="20"/>
+              </w:rPr>
+              <w:t>imputer_mean = SimpleImputer(strategy='mean', missing_values=np.nan)</w:t>
+            </w:r>
+          </w:p>
+          <w:p>
+            <w:pPr>
+              <w:spacing w:after="0"/>
+            </w:pPr>
+            <w:r>
+              <w:rPr>
+                <w:rFonts w:ascii="Consolas" w:hAnsi="Consolas"/>
+                <w:sz w:val="20"/>
+              </w:rPr>
+              <w:t>df['Age'] = imputer_mean.fit_transform(df[['Age']]).ravel()</w:t>
+            </w:r>
+          </w:p>
+          <w:p>
+            <w:pPr>
+              <w:spacing w:after="0"/>
+            </w:pPr>
+            <w:r>
+              <w:rPr>
+                <w:rFonts w:ascii="Consolas" w:hAnsi="Consolas"/>
+                <w:sz w:val="20"/>
+              </w:rPr>
+            </w:r>
+          </w:p>
+          <w:p>
+            <w:pPr>
+              <w:spacing w:after="0"/>
+            </w:pPr>
+            <w:r>
+              <w:rPr>
+                <w:rFonts w:ascii="Consolas" w:hAnsi="Consolas"/>
+                <w:sz w:val="20"/>
+              </w:rPr>
+              <w:t># the same fix with plain pandas</w:t>
+            </w:r>
+          </w:p>
+          <w:p>
+            <w:pPr>
+              <w:spacing w:after="0"/>
+            </w:pPr>
+            <w:r>
+              <w:rPr>
+                <w:rFonts w:ascii="Consolas" w:hAnsi="Consolas"/>
+                <w:sz w:val="20"/>
+              </w:rPr>
+              <w:t>age_mean = df['Age'].mean()</w:t>
+            </w:r>
+          </w:p>
+          <w:p>
+            <w:pPr>
+              <w:spacing w:after="0"/>
+            </w:pPr>
+            <w:r>
+              <w:rPr>
+                <w:rFonts w:ascii="Consolas" w:hAnsi="Consolas"/>
+                <w:sz w:val="20"/>
+              </w:rPr>
+              <w:t>df.loc[df['Age'].isna(), 'Age'] = age_mean</w:t>
+            </w:r>
+          </w:p>
+          <w:p>
+            <w:pPr>
+              <w:spacing w:after="0"/>
+            </w:pPr>
+            <w:r>
+              <w:rPr>
+                <w:rFonts w:ascii="Consolas" w:hAnsi="Consolas"/>
+                <w:sz w:val="20"/>
+              </w:rPr>
+            </w:r>
+          </w:p>
+          <w:p>
+            <w:pPr>
+              <w:spacing w:after="0"/>
+            </w:pPr>
+            <w:r>
+              <w:rPr>
+                <w:rFonts w:ascii="Consolas" w:hAnsi="Consolas"/>
+                <w:sz w:val="20"/>
+              </w:rPr>
+              <w:t>from sklearn.preprocessing import StandardScaler</w:t>
+            </w:r>
+          </w:p>
+          <w:p>
+            <w:pPr>
+              <w:spacing w:after="0"/>
+            </w:pPr>
+            <w:r>
+              <w:rPr>
+                <w:rFonts w:ascii="Consolas" w:hAnsi="Consolas"/>
+                <w:sz w:val="20"/>
+              </w:rPr>
+              <w:t>scaler = StandardScaler()</w:t>
+            </w:r>
+          </w:p>
+          <w:p>
+            <w:pPr>
+              <w:spacing w:after="0"/>
+            </w:pPr>
+            <w:r>
+              <w:rPr>
+                <w:rFonts w:ascii="Consolas" w:hAnsi="Consolas"/>
+                <w:sz w:val="20"/>
+              </w:rPr>
+              <w:t>numeric_cols = df.select_dtypes(include='number').columns</w:t>
+            </w:r>
+          </w:p>
+          <w:p>
+            <w:pPr>
+              <w:spacing w:after="0"/>
+            </w:pPr>
+            <w:r>
+              <w:rPr>
+                <w:rFonts w:ascii="Consolas" w:hAnsi="Consolas"/>
+                <w:sz w:val="20"/>
+              </w:rPr>
+              <w:t>df[numeric_cols] = scaler.fit_transform(df[numeric_cols])</w:t>
+            </w:r>
+          </w:p>
+          <w:p>
+            <w:pPr>
+              <w:spacing w:after="0"/>
+            </w:pPr>
+            <w:r>
+              <w:rPr>
+                <w:rFonts w:ascii="Consolas" w:hAnsi="Consolas"/>
+                <w:sz w:val="20"/>
+              </w:rPr>
+            </w:r>
+          </w:p>
+          <w:p>
+            <w:pPr>
+              <w:spacing w:after="0"/>
+            </w:pPr>
+            <w:r>
+              <w:rPr>
+                <w:rFonts w:ascii="Consolas" w:hAnsi="Consolas"/>
+                <w:sz w:val="20"/>
+              </w:rPr>
+              <w:t>from sklearn.preprocessing import MinMaxScaler</w:t>
+            </w:r>
+          </w:p>
+          <w:p>
+            <w:pPr>
+              <w:spacing w:after="0"/>
+            </w:pPr>
+            <w:r>
+              <w:rPr>
+                <w:rFonts w:ascii="Consolas" w:hAnsi="Consolas"/>
+                <w:sz w:val="20"/>
+              </w:rPr>
+              <w:t>scaler = MinMaxScaler()</w:t>
+            </w:r>
+          </w:p>
+          <w:p>
+            <w:pPr>
+              <w:spacing w:after="0"/>
+            </w:pPr>
+            <w:r>
+              <w:rPr>
+                <w:rFonts w:ascii="Consolas" w:hAnsi="Consolas"/>
+                <w:sz w:val="20"/>
+              </w:rPr>
+              <w:t>df[numeric_cols] = scaler.fit_transform(df[numeric_cols])</w:t>
+            </w:r>
+          </w:p>
+        </w:tc>
+      </w:tr>
+    </w:tbl>
+    <w:p>
+      <w:pPr>
+        <w:spacing w:after="40"/>
+      </w:pPr>
+    </w:p>
+    <w:p>
+      <w:pPr>
+        <w:pStyle w:val="ListBullet"/>
+      </w:pPr>
+      <w:r>
+        <w:rPr>
+          <w:b w:val="0"/>
+        </w:rPr>
+        <w:t>strategy can be 'mean', 'median', 'most_frequent', or 'constant'. Missing values are marked np.nan.</w:t>
+      </w:r>
+    </w:p>
+    <w:p>
+      <w:pPr>
+        <w:pStyle w:val="ListBullet"/>
+      </w:pPr>
+      <w:r>
+        <w:rPr>
+          <w:b w:val="0"/>
+        </w:rPr>
+        <w:t xml:space="preserve">fit_transform wants a </w:t>
+      </w:r>
+      <w:r>
+        <w:rPr>
+          <w:b/>
+        </w:rPr>
+        <w:t>2-D</w:t>
+      </w:r>
+      <w:r>
+        <w:rPr>
+          <w:b w:val="0"/>
+        </w:rPr>
+        <w:t xml:space="preserve"> input, so it is df[['Age']] with </w:t>
+      </w:r>
+      <w:r>
+        <w:rPr>
+          <w:b/>
+        </w:rPr>
+        <w:t>double brackets</w:t>
+      </w:r>
+      <w:r>
+        <w:rPr>
+          <w:b w:val="0"/>
+        </w:rPr>
+        <w:t>; .ravel() flattens the result back to one column.</w:t>
+      </w:r>
+    </w:p>
+    <w:p>
+      <w:pPr>
+        <w:pStyle w:val="ListBullet"/>
+      </w:pPr>
+      <w:r>
+        <w:rPr>
+          <w:b w:val="0"/>
+        </w:rPr>
+        <w:t>pd.isnull(value) or .isna() finds missing values; int(value) inside try/except ValueError finds invalid integers.</w:t>
+      </w:r>
+    </w:p>
+    <w:p>
+      <w:pPr>
+        <w:pStyle w:val="ListBullet"/>
+      </w:pPr>
+      <w:r>
+        <w:rPr>
+          <w:b/>
+        </w:rPr>
+        <w:t>StandardScaler</w:t>
+      </w:r>
+      <w:r>
+        <w:rPr>
+          <w:b w:val="0"/>
+        </w:rPr>
+        <w:t xml:space="preserve"> = mean 0, standard deviation 1. </w:t>
+      </w:r>
+      <w:r>
+        <w:rPr>
+          <w:b/>
+        </w:rPr>
+        <w:t>MinMaxScaler</w:t>
+      </w:r>
+      <w:r>
+        <w:rPr>
+          <w:b w:val="0"/>
+        </w:rPr>
+        <w:t xml:space="preserve"> = squeezes to 0 to 1.</w:t>
+      </w:r>
+    </w:p>
+    <w:p>
+      <w:pPr>
+        <w:pStyle w:val="ListBullet"/>
+      </w:pPr>
+      <w:r>
+        <w:rPr>
+          <w:b w:val="0"/>
+        </w:rPr>
+        <w:t>select_dtypes(include='number').columns picks every numeric column.</w:t>
+      </w:r>
+    </w:p>
+    <w:tbl>
+      <w:tblPr>
+        <w:tblStyle w:val="TableGrid"/>
+        <w:tblW w:type="auto" w:w="0"/>
+        <w:tblLook w:firstColumn="1" w:firstRow="1" w:lastColumn="0" w:lastRow="0" w:noHBand="0" w:noVBand="1" w:val="04A0"/>
+      </w:tblPr>
+      <w:tblGrid>
+        <w:gridCol w:w="9360"/>
+      </w:tblGrid>
+      <w:tr>
+        <w:tc>
+          <w:tcPr>
+            <w:tcW w:type="dxa" w:w="9360"/>
+            <w:shd w:val="clear" w:color="auto" w:fill="FDECEA"/>
+          </w:tcPr>
+          <w:p>
+            <w:r/>
+            <w:r>
+              <w:rPr>
+                <w:b/>
+              </w:rPr>
+              <w:t>Watch Out</w:t>
+            </w:r>
+          </w:p>
+          <w:p>
+            <w:r>
+              <w:rPr>
+                <w:b w:val="0"/>
+              </w:rPr>
+              <w:t xml:space="preserve">Fill-in-the-blank traps: train_test_split returns </w:t>
+            </w:r>
+            <w:r>
+              <w:rPr>
+                <w:b/>
+              </w:rPr>
+              <w:t>four</w:t>
+            </w:r>
+            <w:r>
+              <w:rPr>
+                <w:b w:val="0"/>
+              </w:rPr>
+              <w:t xml:space="preserve"> things in the order </w:t>
+            </w:r>
+            <w:r>
+              <w:rPr>
+                <w:b/>
+              </w:rPr>
+              <w:t>X_train, X_test, y_train, y_test</w:t>
+            </w:r>
+            <w:r>
+              <w:rPr>
+                <w:b w:val="0"/>
+              </w:rPr>
+              <w:t xml:space="preserve">. fit takes </w:t>
+            </w:r>
+            <w:r>
+              <w:rPr>
+                <w:b/>
+              </w:rPr>
+              <w:t>train</w:t>
+            </w:r>
+            <w:r>
+              <w:rPr>
+                <w:b w:val="0"/>
+              </w:rPr>
+              <w:t xml:space="preserve"> data; score takes </w:t>
+            </w:r>
+            <w:r>
+              <w:rPr>
+                <w:b/>
+              </w:rPr>
+              <w:t>test</w:t>
+            </w:r>
+            <w:r>
+              <w:rPr>
+                <w:b w:val="0"/>
+              </w:rPr>
+              <w:t xml:space="preserve"> data. n_neighbors is the k parameter. Double brackets [['Age']] give a table, single brackets give one column.</w:t>
+            </w:r>
+          </w:p>
+        </w:tc>
+      </w:tr>
+    </w:tbl>
+    <w:p>
+      <w:pPr>
+        <w:spacing w:after="40"/>
+      </w:pPr>
+    </w:p>
+    <w:p>
       <w:r>
         <w:br w:type="page"/>
       </w:r>
@@ -13343,6 +15165,119 @@
           <w:b w:val="0"/>
         </w:rPr>
         <w:t>OLS: small gap and mediocre score = underfit; huge train-test gap (many features) = overfit.</w:t>
+      </w:r>
+    </w:p>
+    <w:p>
+      <w:pPr>
+        <w:pStyle w:val="ListBullet"/>
+      </w:pPr>
+      <w:r>
+        <w:rPr>
+          <w:b/>
+        </w:rPr>
+        <w:t>Code</w:t>
+      </w:r>
+      <w:r>
+        <w:rPr>
+          <w:b w:val="0"/>
+        </w:rPr>
+        <w:t xml:space="preserve">: load, </w:t>
+      </w:r>
+      <w:r>
+        <w:rPr>
+          <w:b/>
+        </w:rPr>
+        <w:t>train_test_split</w:t>
+      </w:r>
+      <w:r>
+        <w:rPr>
+          <w:b w:val="0"/>
+        </w:rPr>
+        <w:t xml:space="preserve"> (X_train, X_test, y_train, y_test), </w:t>
+      </w:r>
+      <w:r>
+        <w:rPr>
+          <w:b/>
+        </w:rPr>
+        <w:t>KNeighborsClassifier(n_neighbors=k)</w:t>
+      </w:r>
+      <w:r>
+        <w:rPr>
+          <w:b w:val="0"/>
+        </w:rPr>
+        <w:t xml:space="preserve">, </w:t>
+      </w:r>
+      <w:r>
+        <w:rPr>
+          <w:b/>
+        </w:rPr>
+        <w:t>fit(train)</w:t>
+      </w:r>
+      <w:r>
+        <w:rPr>
+          <w:b w:val="0"/>
+        </w:rPr>
+        <w:t xml:space="preserve">, </w:t>
+      </w:r>
+      <w:r>
+        <w:rPr>
+          <w:b/>
+        </w:rPr>
+        <w:t>predict(test)</w:t>
+      </w:r>
+      <w:r>
+        <w:rPr>
+          <w:b w:val="0"/>
+        </w:rPr>
+        <w:t xml:space="preserve">, </w:t>
+      </w:r>
+      <w:r>
+        <w:rPr>
+          <w:b/>
+        </w:rPr>
+        <w:t>score(test)</w:t>
+      </w:r>
+      <w:r>
+        <w:rPr>
+          <w:b w:val="0"/>
+        </w:rPr>
+        <w:t xml:space="preserve">. </w:t>
+      </w:r>
+      <w:r>
+        <w:rPr>
+          <w:b/>
+        </w:rPr>
+        <w:t>SimpleImputer(strategy='mean')</w:t>
+      </w:r>
+      <w:r>
+        <w:rPr>
+          <w:b w:val="0"/>
+        </w:rPr>
+        <w:t xml:space="preserve"> and </w:t>
+      </w:r>
+      <w:r>
+        <w:rPr>
+          <w:b/>
+        </w:rPr>
+        <w:t>StandardScaler / MinMaxScaler</w:t>
+      </w:r>
+      <w:r>
+        <w:rPr>
+          <w:b w:val="0"/>
+        </w:rPr>
+        <w:t xml:space="preserve"> use </w:t>
+      </w:r>
+      <w:r>
+        <w:rPr>
+          <w:b/>
+        </w:rPr>
+        <w:t>fit_transform(df[['col']])</w:t>
+      </w:r>
+      <w:r>
+        <w:rPr>
+          <w:b w:val="0"/>
+        </w:rPr>
+        <w:t>.</w:t>
       </w:r>
     </w:p>
     <w:p>

</xml_diff>

<commit_message>
ML midterm reviewer: add M2 picture-slide code and all imports
Co-Authored-By: Claude Sonnet 5.5 <noreply@anthropic.com>
</commit_message>
<xml_diff>
--- a/Machine Learning Algorithm/PAMESA - ML Midterm Reviewer.docx
+++ b/Machine Learning Algorithm/PAMESA - ML Midterm Reviewer.docx
@@ -12822,7 +12822,7 @@
         <w:rPr>
           <w:b w:val="0"/>
         </w:rPr>
-        <w:t xml:space="preserve"> where you complete missing code taken from the module. Everything in this part is copied from the prof's M2.ipynb and the M1 preprocessing notebook.</w:t>
+        <w:t xml:space="preserve"> where you complete missing code taken from the module. Everything in this part is copied from the prof's M2.ipynb, the M1 preprocessing notebook, and the code shown in the M2 picture slides (read slide by slide). The slides name the k-NN model clf and the notebook names it knn, so know both.</w:t>
       </w:r>
     </w:p>
     <w:p>
@@ -13172,6 +13172,426 @@
                 <w:b w:val="0"/>
               </w:rPr>
               <w:t>from sklearn.metrics import accuracy_score</w:t>
+            </w:r>
+          </w:p>
+        </w:tc>
+      </w:tr>
+      <w:tr>
+        <w:tc>
+          <w:tcPr>
+            <w:tcW w:type="dxa" w:w="2880"/>
+          </w:tcPr>
+          <w:p>
+            <w:r/>
+            <w:r>
+              <w:rPr>
+                <w:b w:val="0"/>
+              </w:rPr>
+              <w:t>Forge / wave data</w:t>
+            </w:r>
+          </w:p>
+        </w:tc>
+        <w:tc>
+          <w:tcPr>
+            <w:tcW w:type="dxa" w:w="6480"/>
+          </w:tcPr>
+          <w:p>
+            <w:r/>
+            <w:r>
+              <w:rPr>
+                <w:b w:val="0"/>
+              </w:rPr>
+              <w:t>import mglearn, then mglearn.datasets.make_forge() or make_wave(n_samples=40)</w:t>
+            </w:r>
+          </w:p>
+        </w:tc>
+      </w:tr>
+      <w:tr>
+        <w:tc>
+          <w:tcPr>
+            <w:tcW w:type="dxa" w:w="2880"/>
+          </w:tcPr>
+          <w:p>
+            <w:r/>
+            <w:r>
+              <w:rPr>
+                <w:b w:val="0"/>
+              </w:rPr>
+              <w:t>Moons data</w:t>
+            </w:r>
+          </w:p>
+        </w:tc>
+        <w:tc>
+          <w:tcPr>
+            <w:tcW w:type="dxa" w:w="6480"/>
+          </w:tcPr>
+          <w:p>
+            <w:r/>
+            <w:r>
+              <w:rPr>
+                <w:b w:val="0"/>
+              </w:rPr>
+              <w:t>from sklearn.datasets import make_moons</w:t>
+            </w:r>
+          </w:p>
+        </w:tc>
+      </w:tr>
+      <w:tr>
+        <w:tc>
+          <w:tcPr>
+            <w:tcW w:type="dxa" w:w="2880"/>
+          </w:tcPr>
+          <w:p>
+            <w:r/>
+            <w:r>
+              <w:rPr>
+                <w:b w:val="0"/>
+              </w:rPr>
+              <w:t>California housing</w:t>
+            </w:r>
+          </w:p>
+        </w:tc>
+        <w:tc>
+          <w:tcPr>
+            <w:tcW w:type="dxa" w:w="6480"/>
+          </w:tcPr>
+          <w:p>
+            <w:r/>
+            <w:r>
+              <w:rPr>
+                <w:b w:val="0"/>
+              </w:rPr>
+              <w:t>from sklearn.datasets import fetch_california_housing</w:t>
+            </w:r>
+          </w:p>
+        </w:tc>
+      </w:tr>
+      <w:tr>
+        <w:tc>
+          <w:tcPr>
+            <w:tcW w:type="dxa" w:w="2880"/>
+          </w:tcPr>
+          <w:p>
+            <w:r/>
+            <w:r>
+              <w:rPr>
+                <w:b w:val="0"/>
+              </w:rPr>
+              <w:t>k-NN regressor</w:t>
+            </w:r>
+          </w:p>
+        </w:tc>
+        <w:tc>
+          <w:tcPr>
+            <w:tcW w:type="dxa" w:w="6480"/>
+          </w:tcPr>
+          <w:p>
+            <w:r/>
+            <w:r>
+              <w:rPr>
+                <w:b w:val="0"/>
+              </w:rPr>
+              <w:t>from sklearn.neighbors import KNeighborsRegressor</w:t>
+            </w:r>
+          </w:p>
+        </w:tc>
+      </w:tr>
+      <w:tr>
+        <w:tc>
+          <w:tcPr>
+            <w:tcW w:type="dxa" w:w="2880"/>
+          </w:tcPr>
+          <w:p>
+            <w:r/>
+            <w:r>
+              <w:rPr>
+                <w:b w:val="0"/>
+              </w:rPr>
+              <w:t>Linear regression</w:t>
+            </w:r>
+          </w:p>
+        </w:tc>
+        <w:tc>
+          <w:tcPr>
+            <w:tcW w:type="dxa" w:w="6480"/>
+          </w:tcPr>
+          <w:p>
+            <w:r/>
+            <w:r>
+              <w:rPr>
+                <w:b w:val="0"/>
+              </w:rPr>
+              <w:t>from sklearn.linear_model import LinearRegression</w:t>
+            </w:r>
+          </w:p>
+        </w:tc>
+      </w:tr>
+      <w:tr>
+        <w:tc>
+          <w:tcPr>
+            <w:tcW w:type="dxa" w:w="2880"/>
+          </w:tcPr>
+          <w:p>
+            <w:r/>
+            <w:r>
+              <w:rPr>
+                <w:b w:val="0"/>
+              </w:rPr>
+              <w:t>Ridge</w:t>
+            </w:r>
+          </w:p>
+        </w:tc>
+        <w:tc>
+          <w:tcPr>
+            <w:tcW w:type="dxa" w:w="6480"/>
+          </w:tcPr>
+          <w:p>
+            <w:r/>
+            <w:r>
+              <w:rPr>
+                <w:b w:val="0"/>
+              </w:rPr>
+              <w:t>from sklearn.linear_model import Ridge</w:t>
+            </w:r>
+          </w:p>
+        </w:tc>
+      </w:tr>
+      <w:tr>
+        <w:tc>
+          <w:tcPr>
+            <w:tcW w:type="dxa" w:w="2880"/>
+          </w:tcPr>
+          <w:p>
+            <w:r/>
+            <w:r>
+              <w:rPr>
+                <w:b w:val="0"/>
+              </w:rPr>
+              <w:t>Lasso</w:t>
+            </w:r>
+          </w:p>
+        </w:tc>
+        <w:tc>
+          <w:tcPr>
+            <w:tcW w:type="dxa" w:w="6480"/>
+          </w:tcPr>
+          <w:p>
+            <w:r/>
+            <w:r>
+              <w:rPr>
+                <w:b w:val="0"/>
+              </w:rPr>
+              <w:t>from sklearn.linear_model import Lasso</w:t>
+            </w:r>
+          </w:p>
+        </w:tc>
+      </w:tr>
+      <w:tr>
+        <w:tc>
+          <w:tcPr>
+            <w:tcW w:type="dxa" w:w="2880"/>
+          </w:tcPr>
+          <w:p>
+            <w:r/>
+            <w:r>
+              <w:rPr>
+                <w:b w:val="0"/>
+              </w:rPr>
+              <w:t>Logistic regression</w:t>
+            </w:r>
+          </w:p>
+        </w:tc>
+        <w:tc>
+          <w:tcPr>
+            <w:tcW w:type="dxa" w:w="6480"/>
+          </w:tcPr>
+          <w:p>
+            <w:r/>
+            <w:r>
+              <w:rPr>
+                <w:b w:val="0"/>
+              </w:rPr>
+              <w:t>from sklearn.linear_model import LogisticRegression</w:t>
+            </w:r>
+          </w:p>
+        </w:tc>
+      </w:tr>
+      <w:tr>
+        <w:tc>
+          <w:tcPr>
+            <w:tcW w:type="dxa" w:w="2880"/>
+          </w:tcPr>
+          <w:p>
+            <w:r/>
+            <w:r>
+              <w:rPr>
+                <w:b w:val="0"/>
+              </w:rPr>
+              <w:t>Linear SVM</w:t>
+            </w:r>
+          </w:p>
+        </w:tc>
+        <w:tc>
+          <w:tcPr>
+            <w:tcW w:type="dxa" w:w="6480"/>
+          </w:tcPr>
+          <w:p>
+            <w:r/>
+            <w:r>
+              <w:rPr>
+                <w:b w:val="0"/>
+              </w:rPr>
+              <w:t>from sklearn.svm import LinearSVC</w:t>
+            </w:r>
+          </w:p>
+        </w:tc>
+      </w:tr>
+      <w:tr>
+        <w:tc>
+          <w:tcPr>
+            <w:tcW w:type="dxa" w:w="2880"/>
+          </w:tcPr>
+          <w:p>
+            <w:r/>
+            <w:r>
+              <w:rPr>
+                <w:b w:val="0"/>
+              </w:rPr>
+              <w:t>Kernel SVM</w:t>
+            </w:r>
+          </w:p>
+        </w:tc>
+        <w:tc>
+          <w:tcPr>
+            <w:tcW w:type="dxa" w:w="6480"/>
+          </w:tcPr>
+          <w:p>
+            <w:r/>
+            <w:r>
+              <w:rPr>
+                <w:b w:val="0"/>
+              </w:rPr>
+              <w:t>from sklearn.svm import SVC</w:t>
+            </w:r>
+          </w:p>
+        </w:tc>
+      </w:tr>
+      <w:tr>
+        <w:tc>
+          <w:tcPr>
+            <w:tcW w:type="dxa" w:w="2880"/>
+          </w:tcPr>
+          <w:p>
+            <w:r/>
+            <w:r>
+              <w:rPr>
+                <w:b w:val="0"/>
+              </w:rPr>
+              <w:t>Decision tree</w:t>
+            </w:r>
+          </w:p>
+        </w:tc>
+        <w:tc>
+          <w:tcPr>
+            <w:tcW w:type="dxa" w:w="6480"/>
+          </w:tcPr>
+          <w:p>
+            <w:r/>
+            <w:r>
+              <w:rPr>
+                <w:b w:val="0"/>
+              </w:rPr>
+              <w:t>from sklearn.tree import DecisionTreeClassifier (regression: DecisionTreeRegressor)</w:t>
+            </w:r>
+          </w:p>
+        </w:tc>
+      </w:tr>
+      <w:tr>
+        <w:tc>
+          <w:tcPr>
+            <w:tcW w:type="dxa" w:w="2880"/>
+          </w:tcPr>
+          <w:p>
+            <w:r/>
+            <w:r>
+              <w:rPr>
+                <w:b w:val="0"/>
+              </w:rPr>
+              <w:t>Export a tree</w:t>
+            </w:r>
+          </w:p>
+        </w:tc>
+        <w:tc>
+          <w:tcPr>
+            <w:tcW w:type="dxa" w:w="6480"/>
+          </w:tcPr>
+          <w:p>
+            <w:r/>
+            <w:r>
+              <w:rPr>
+                <w:b w:val="0"/>
+              </w:rPr>
+              <w:t>from sklearn.tree import export_graphviz, then import graphviz</w:t>
+            </w:r>
+          </w:p>
+        </w:tc>
+      </w:tr>
+      <w:tr>
+        <w:tc>
+          <w:tcPr>
+            <w:tcW w:type="dxa" w:w="2880"/>
+          </w:tcPr>
+          <w:p>
+            <w:r/>
+            <w:r>
+              <w:rPr>
+                <w:b w:val="0"/>
+              </w:rPr>
+              <w:t>Random forest</w:t>
+            </w:r>
+          </w:p>
+        </w:tc>
+        <w:tc>
+          <w:tcPr>
+            <w:tcW w:type="dxa" w:w="6480"/>
+          </w:tcPr>
+          <w:p>
+            <w:r/>
+            <w:r>
+              <w:rPr>
+                <w:b w:val="0"/>
+              </w:rPr>
+              <w:t>from sklearn.ensemble import RandomForestClassifier</w:t>
+            </w:r>
+          </w:p>
+        </w:tc>
+      </w:tr>
+      <w:tr>
+        <w:tc>
+          <w:tcPr>
+            <w:tcW w:type="dxa" w:w="2880"/>
+          </w:tcPr>
+          <w:p>
+            <w:r/>
+            <w:r>
+              <w:rPr>
+                <w:b w:val="0"/>
+              </w:rPr>
+              <w:t>Gradient boosting</w:t>
+            </w:r>
+          </w:p>
+        </w:tc>
+        <w:tc>
+          <w:tcPr>
+            <w:tcW w:type="dxa" w:w="6480"/>
+          </w:tcPr>
+          <w:p>
+            <w:r/>
+            <w:r>
+              <w:rPr>
+                <w:b w:val="0"/>
+              </w:rPr>
+              <w:t>from sklearn.ensemble import GradientBoostingClassifier</w:t>
             </w:r>
           </w:p>
         </w:tc>
@@ -13392,7 +13812,66 @@
         <w:rPr>
           <w:b w:val="0"/>
         </w:rPr>
-        <w:t>Standard scikit-learn paths for the other algorithms (not in the module notebooks, so lower odds): sklearn.linear_model (LinearRegression, Ridge, Lasso, LogisticRegression), sklearn.naive_bayes (GaussianNB), sklearn.tree (DecisionTreeClassifier), sklearn.ensemble (RandomForestClassifier, GradientBoostingClassifier), sklearn.svm (SVC, LinearSVC).</w:t>
+        <w:t xml:space="preserve">Naive Bayes shows </w:t>
+      </w:r>
+      <w:r>
+        <w:rPr>
+          <w:b/>
+        </w:rPr>
+        <w:t>no code</w:t>
+      </w:r>
+      <w:r>
+        <w:rPr>
+          <w:b w:val="0"/>
+        </w:rPr>
+        <w:t xml:space="preserve"> on the slides. They only name the three classes: </w:t>
+      </w:r>
+      <w:r>
+        <w:rPr>
+          <w:b/>
+        </w:rPr>
+        <w:t>GaussianNB</w:t>
+      </w:r>
+      <w:r>
+        <w:rPr>
+          <w:b w:val="0"/>
+        </w:rPr>
+        <w:t xml:space="preserve"> (continuous), </w:t>
+      </w:r>
+      <w:r>
+        <w:rPr>
+          <w:b/>
+        </w:rPr>
+        <w:t>BernoulliNB</w:t>
+      </w:r>
+      <w:r>
+        <w:rPr>
+          <w:b w:val="0"/>
+        </w:rPr>
+        <w:t xml:space="preserve"> (binary), </w:t>
+      </w:r>
+      <w:r>
+        <w:rPr>
+          <w:b/>
+        </w:rPr>
+        <w:t>MultinomialNB</w:t>
+      </w:r>
+      <w:r>
+        <w:rPr>
+          <w:b w:val="0"/>
+        </w:rPr>
+        <w:t xml:space="preserve"> (counts). Their import path, sklearn.naive_bayes, is standard scikit-learn and is not shown on the slides.</w:t>
+      </w:r>
+    </w:p>
+    <w:p>
+      <w:pPr>
+        <w:spacing w:after="120"/>
+      </w:pPr>
+      <w:r>
+        <w:rPr>
+          <w:b w:val="0"/>
+        </w:rPr>
+        <w:t>Note: the slide code assumes imports it does not always show (train_test_split, plt, np, LinearRegression), so know those import lines on your own.</w:t>
       </w:r>
     </w:p>
     <w:p>
@@ -13400,7 +13879,7 @@
         <w:pStyle w:val="Heading2"/>
       </w:pPr>
       <w:r>
-        <w:t>Code 1. k-NN On Iris (Most Likely 7-Point Item)</w:t>
+        <w:t>Code 1. k-NN On Iris (Notebook)</w:t>
       </w:r>
     </w:p>
     <w:tbl>
@@ -14594,6 +15073,3471 @@
                 <w:b w:val="0"/>
               </w:rPr>
               <w:t xml:space="preserve"> data. n_neighbors is the k parameter. Double brackets [['Age']] give a table, single brackets give one column.</w:t>
+            </w:r>
+          </w:p>
+        </w:tc>
+      </w:tr>
+    </w:tbl>
+    <w:p>
+      <w:pPr>
+        <w:spacing w:after="40"/>
+      </w:pPr>
+    </w:p>
+    <w:p>
+      <w:pPr>
+        <w:pStyle w:val="Heading1"/>
+      </w:pPr>
+      <w:r>
+        <w:t>Slide Code (M2 Picture Slides)</w:t>
+      </w:r>
+    </w:p>
+    <w:p>
+      <w:pPr>
+        <w:spacing w:after="120"/>
+      </w:pPr>
+      <w:r>
+        <w:rPr>
+          <w:b w:val="0"/>
+        </w:rPr>
+        <w:t>Everything below is code printed in the M2 slide images, read slide by slide. Variable names are the slides' own.</w:t>
+      </w:r>
+    </w:p>
+    <w:p>
+      <w:pPr>
+        <w:pStyle w:val="Heading2"/>
+      </w:pPr>
+      <w:r>
+        <w:t>Code 4. k-NN Classifier, Slide Version (clf)</w:t>
+      </w:r>
+    </w:p>
+    <w:tbl>
+      <w:tblPr>
+        <w:tblStyle w:val="TableGrid"/>
+        <w:tblW w:type="auto" w:w="0"/>
+        <w:tblLook w:firstColumn="1" w:firstRow="1" w:lastColumn="0" w:lastRow="0" w:noHBand="0" w:noVBand="1" w:val="04A0"/>
+      </w:tblPr>
+      <w:tblGrid>
+        <w:gridCol w:w="9360"/>
+      </w:tblGrid>
+      <w:tr>
+        <w:tc>
+          <w:tcPr>
+            <w:tcW w:type="dxa" w:w="9360"/>
+            <w:shd w:val="clear" w:color="auto" w:fill="F5F5F5"/>
+          </w:tcPr>
+          <w:p>
+            <w:r/>
+            <w:r>
+              <w:rPr>
+                <w:b/>
+              </w:rPr>
+              <w:t>Forge data, k = 3</w:t>
+            </w:r>
+          </w:p>
+          <w:p>
+            <w:pPr>
+              <w:spacing w:after="0"/>
+            </w:pPr>
+            <w:r>
+              <w:rPr>
+                <w:rFonts w:ascii="Consolas" w:hAnsi="Consolas"/>
+                <w:sz w:val="20"/>
+              </w:rPr>
+              <w:t>from sklearn.model_selection import train_test_split</w:t>
+            </w:r>
+          </w:p>
+          <w:p>
+            <w:pPr>
+              <w:spacing w:after="0"/>
+            </w:pPr>
+            <w:r>
+              <w:rPr>
+                <w:rFonts w:ascii="Consolas" w:hAnsi="Consolas"/>
+                <w:sz w:val="20"/>
+              </w:rPr>
+              <w:t>X, y = mglearn.datasets.make_forge()</w:t>
+            </w:r>
+          </w:p>
+          <w:p>
+            <w:pPr>
+              <w:spacing w:after="0"/>
+            </w:pPr>
+            <w:r>
+              <w:rPr>
+                <w:rFonts w:ascii="Consolas" w:hAnsi="Consolas"/>
+                <w:sz w:val="20"/>
+              </w:rPr>
+              <w:t>X_train, X_test, y_train, y_test = train_test_split(X, y, random_state=0)</w:t>
+            </w:r>
+          </w:p>
+          <w:p>
+            <w:pPr>
+              <w:spacing w:after="0"/>
+            </w:pPr>
+            <w:r>
+              <w:rPr>
+                <w:rFonts w:ascii="Consolas" w:hAnsi="Consolas"/>
+                <w:sz w:val="20"/>
+              </w:rPr>
+            </w:r>
+          </w:p>
+          <w:p>
+            <w:pPr>
+              <w:spacing w:after="0"/>
+            </w:pPr>
+            <w:r>
+              <w:rPr>
+                <w:rFonts w:ascii="Consolas" w:hAnsi="Consolas"/>
+                <w:sz w:val="20"/>
+              </w:rPr>
+              <w:t>from sklearn.neighbors import KNeighborsClassifier</w:t>
+            </w:r>
+          </w:p>
+          <w:p>
+            <w:pPr>
+              <w:spacing w:after="0"/>
+            </w:pPr>
+            <w:r>
+              <w:rPr>
+                <w:rFonts w:ascii="Consolas" w:hAnsi="Consolas"/>
+                <w:sz w:val="20"/>
+              </w:rPr>
+              <w:t>clf = KNeighborsClassifier(n_neighbors=3)</w:t>
+            </w:r>
+          </w:p>
+          <w:p>
+            <w:pPr>
+              <w:spacing w:after="0"/>
+            </w:pPr>
+            <w:r>
+              <w:rPr>
+                <w:rFonts w:ascii="Consolas" w:hAnsi="Consolas"/>
+                <w:sz w:val="20"/>
+              </w:rPr>
+              <w:t>clf.fit(X_train, y_train)</w:t>
+            </w:r>
+          </w:p>
+          <w:p>
+            <w:pPr>
+              <w:spacing w:after="0"/>
+            </w:pPr>
+            <w:r>
+              <w:rPr>
+                <w:rFonts w:ascii="Consolas" w:hAnsi="Consolas"/>
+                <w:sz w:val="20"/>
+              </w:rPr>
+            </w:r>
+          </w:p>
+          <w:p>
+            <w:pPr>
+              <w:spacing w:after="0"/>
+            </w:pPr>
+            <w:r>
+              <w:rPr>
+                <w:rFonts w:ascii="Consolas" w:hAnsi="Consolas"/>
+                <w:sz w:val="20"/>
+              </w:rPr>
+              <w:t>print("Test set predictions: {}".format(clf.predict(X_test)))</w:t>
+            </w:r>
+          </w:p>
+          <w:p>
+            <w:pPr>
+              <w:spacing w:after="0"/>
+            </w:pPr>
+            <w:r>
+              <w:rPr>
+                <w:rFonts w:ascii="Consolas" w:hAnsi="Consolas"/>
+                <w:sz w:val="20"/>
+              </w:rPr>
+              <w:t>print("Test set accuracy: {:.2f}".format(clf.score(X_test, y_test)))</w:t>
+            </w:r>
+          </w:p>
+        </w:tc>
+      </w:tr>
+    </w:tbl>
+    <w:p>
+      <w:pPr>
+        <w:spacing w:after="40"/>
+      </w:pPr>
+    </w:p>
+    <w:tbl>
+      <w:tblPr>
+        <w:tblStyle w:val="TableGrid"/>
+        <w:tblW w:type="auto" w:w="0"/>
+        <w:tblLook w:firstColumn="1" w:firstRow="1" w:lastColumn="0" w:lastRow="0" w:noHBand="0" w:noVBand="1" w:val="04A0"/>
+      </w:tblPr>
+      <w:tblGrid>
+        <w:gridCol w:w="9360"/>
+      </w:tblGrid>
+      <w:tr>
+        <w:tc>
+          <w:tcPr>
+            <w:tcW w:type="dxa" w:w="9360"/>
+            <w:shd w:val="clear" w:color="auto" w:fill="F5F5F5"/>
+          </w:tcPr>
+          <w:p>
+            <w:r/>
+            <w:r>
+              <w:rPr>
+                <w:b/>
+              </w:rPr>
+              <w:t>Decision boundaries for k = 1, 3, 9 (loop lines)</w:t>
+            </w:r>
+          </w:p>
+          <w:p>
+            <w:pPr>
+              <w:spacing w:after="0"/>
+            </w:pPr>
+            <w:r>
+              <w:rPr>
+                <w:rFonts w:ascii="Consolas" w:hAnsi="Consolas"/>
+                <w:sz w:val="20"/>
+              </w:rPr>
+              <w:t>for n_neighbors, ax in zip([1, 3, 9], axes):</w:t>
+            </w:r>
+          </w:p>
+          <w:p>
+            <w:pPr>
+              <w:spacing w:after="0"/>
+            </w:pPr>
+            <w:r>
+              <w:rPr>
+                <w:rFonts w:ascii="Consolas" w:hAnsi="Consolas"/>
+                <w:sz w:val="20"/>
+              </w:rPr>
+              <w:t xml:space="preserve">    clf = KNeighborsClassifier(n_neighbors=n_neighbors).fit(X, y)</w:t>
+            </w:r>
+          </w:p>
+          <w:p>
+            <w:pPr>
+              <w:spacing w:after="0"/>
+            </w:pPr>
+            <w:r>
+              <w:rPr>
+                <w:rFonts w:ascii="Consolas" w:hAnsi="Consolas"/>
+                <w:sz w:val="20"/>
+              </w:rPr>
+              <w:t xml:space="preserve">    mglearn.plots.plot_2d_separator(clf, X, fill=True, eps=0.5, ax=ax, alpha=.4)</w:t>
+            </w:r>
+          </w:p>
+          <w:p>
+            <w:pPr>
+              <w:spacing w:after="0"/>
+            </w:pPr>
+            <w:r>
+              <w:rPr>
+                <w:rFonts w:ascii="Consolas" w:hAnsi="Consolas"/>
+                <w:sz w:val="20"/>
+              </w:rPr>
+              <w:t xml:space="preserve">    ax.set_title("{} neighbor(s)".format(n_neighbors))</w:t>
+            </w:r>
+          </w:p>
+        </w:tc>
+      </w:tr>
+    </w:tbl>
+    <w:p>
+      <w:pPr>
+        <w:spacing w:after="40"/>
+      </w:pPr>
+    </w:p>
+    <w:tbl>
+      <w:tblPr>
+        <w:tblStyle w:val="TableGrid"/>
+        <w:tblW w:type="auto" w:w="0"/>
+        <w:tblLook w:firstColumn="1" w:firstRow="1" w:lastColumn="0" w:lastRow="0" w:noHBand="0" w:noVBand="1" w:val="04A0"/>
+      </w:tblPr>
+      <w:tblGrid>
+        <w:gridCol w:w="9360"/>
+      </w:tblGrid>
+      <w:tr>
+        <w:tc>
+          <w:tcPr>
+            <w:tcW w:type="dxa" w:w="9360"/>
+            <w:shd w:val="clear" w:color="auto" w:fill="F5F5F5"/>
+          </w:tcPr>
+          <w:p>
+            <w:r/>
+            <w:r>
+              <w:rPr>
+                <w:b/>
+              </w:rPr>
+              <w:t>Complexity curve on breast cancer (slide uses range(1, 11))</w:t>
+            </w:r>
+          </w:p>
+          <w:p>
+            <w:pPr>
+              <w:spacing w:after="0"/>
+            </w:pPr>
+            <w:r>
+              <w:rPr>
+                <w:rFonts w:ascii="Consolas" w:hAnsi="Consolas"/>
+                <w:sz w:val="20"/>
+              </w:rPr>
+              <w:t>from sklearn.datasets import load_breast_cancer</w:t>
+            </w:r>
+          </w:p>
+          <w:p>
+            <w:pPr>
+              <w:spacing w:after="0"/>
+            </w:pPr>
+            <w:r>
+              <w:rPr>
+                <w:rFonts w:ascii="Consolas" w:hAnsi="Consolas"/>
+                <w:sz w:val="20"/>
+              </w:rPr>
+              <w:t>cancer = load_breast_cancer()</w:t>
+            </w:r>
+          </w:p>
+          <w:p>
+            <w:pPr>
+              <w:spacing w:after="0"/>
+            </w:pPr>
+            <w:r>
+              <w:rPr>
+                <w:rFonts w:ascii="Consolas" w:hAnsi="Consolas"/>
+                <w:sz w:val="20"/>
+              </w:rPr>
+              <w:t>X_train, X_test, y_train, y_test = train_test_split(</w:t>
+            </w:r>
+          </w:p>
+          <w:p>
+            <w:pPr>
+              <w:spacing w:after="0"/>
+            </w:pPr>
+            <w:r>
+              <w:rPr>
+                <w:rFonts w:ascii="Consolas" w:hAnsi="Consolas"/>
+                <w:sz w:val="20"/>
+              </w:rPr>
+              <w:t xml:space="preserve">    cancer.data, cancer.target, stratify=cancer.target, random_state=66)</w:t>
+            </w:r>
+          </w:p>
+          <w:p>
+            <w:pPr>
+              <w:spacing w:after="0"/>
+            </w:pPr>
+            <w:r>
+              <w:rPr>
+                <w:rFonts w:ascii="Consolas" w:hAnsi="Consolas"/>
+                <w:sz w:val="20"/>
+              </w:rPr>
+            </w:r>
+          </w:p>
+          <w:p>
+            <w:pPr>
+              <w:spacing w:after="0"/>
+            </w:pPr>
+            <w:r>
+              <w:rPr>
+                <w:rFonts w:ascii="Consolas" w:hAnsi="Consolas"/>
+                <w:sz w:val="20"/>
+              </w:rPr>
+              <w:t>training_accuracy = []</w:t>
+            </w:r>
+          </w:p>
+          <w:p>
+            <w:pPr>
+              <w:spacing w:after="0"/>
+            </w:pPr>
+            <w:r>
+              <w:rPr>
+                <w:rFonts w:ascii="Consolas" w:hAnsi="Consolas"/>
+                <w:sz w:val="20"/>
+              </w:rPr>
+              <w:t>test_accuracy = []</w:t>
+            </w:r>
+          </w:p>
+          <w:p>
+            <w:pPr>
+              <w:spacing w:after="0"/>
+            </w:pPr>
+            <w:r>
+              <w:rPr>
+                <w:rFonts w:ascii="Consolas" w:hAnsi="Consolas"/>
+                <w:sz w:val="20"/>
+              </w:rPr>
+              <w:t>neighbors_settings = range(1, 11)</w:t>
+            </w:r>
+          </w:p>
+          <w:p>
+            <w:pPr>
+              <w:spacing w:after="0"/>
+            </w:pPr>
+            <w:r>
+              <w:rPr>
+                <w:rFonts w:ascii="Consolas" w:hAnsi="Consolas"/>
+                <w:sz w:val="20"/>
+              </w:rPr>
+            </w:r>
+          </w:p>
+          <w:p>
+            <w:pPr>
+              <w:spacing w:after="0"/>
+            </w:pPr>
+            <w:r>
+              <w:rPr>
+                <w:rFonts w:ascii="Consolas" w:hAnsi="Consolas"/>
+                <w:sz w:val="20"/>
+              </w:rPr>
+              <w:t>for n_neighbors in neighbors_settings:</w:t>
+            </w:r>
+          </w:p>
+          <w:p>
+            <w:pPr>
+              <w:spacing w:after="0"/>
+            </w:pPr>
+            <w:r>
+              <w:rPr>
+                <w:rFonts w:ascii="Consolas" w:hAnsi="Consolas"/>
+                <w:sz w:val="20"/>
+              </w:rPr>
+              <w:t xml:space="preserve">    clf = KNeighborsClassifier(n_neighbors=n_neighbors)</w:t>
+            </w:r>
+          </w:p>
+          <w:p>
+            <w:pPr>
+              <w:spacing w:after="0"/>
+            </w:pPr>
+            <w:r>
+              <w:rPr>
+                <w:rFonts w:ascii="Consolas" w:hAnsi="Consolas"/>
+                <w:sz w:val="20"/>
+              </w:rPr>
+              <w:t xml:space="preserve">    clf.fit(X_train, y_train)</w:t>
+            </w:r>
+          </w:p>
+          <w:p>
+            <w:pPr>
+              <w:spacing w:after="0"/>
+            </w:pPr>
+            <w:r>
+              <w:rPr>
+                <w:rFonts w:ascii="Consolas" w:hAnsi="Consolas"/>
+                <w:sz w:val="20"/>
+              </w:rPr>
+              <w:t xml:space="preserve">    training_accuracy.append(clf.score(X_train, y_train))</w:t>
+            </w:r>
+          </w:p>
+          <w:p>
+            <w:pPr>
+              <w:spacing w:after="0"/>
+            </w:pPr>
+            <w:r>
+              <w:rPr>
+                <w:rFonts w:ascii="Consolas" w:hAnsi="Consolas"/>
+                <w:sz w:val="20"/>
+              </w:rPr>
+              <w:t xml:space="preserve">    test_accuracy.append(clf.score(X_test, y_test))</w:t>
+            </w:r>
+          </w:p>
+          <w:p>
+            <w:pPr>
+              <w:spacing w:after="0"/>
+            </w:pPr>
+            <w:r>
+              <w:rPr>
+                <w:rFonts w:ascii="Consolas" w:hAnsi="Consolas"/>
+                <w:sz w:val="20"/>
+              </w:rPr>
+            </w:r>
+          </w:p>
+          <w:p>
+            <w:pPr>
+              <w:spacing w:after="0"/>
+            </w:pPr>
+            <w:r>
+              <w:rPr>
+                <w:rFonts w:ascii="Consolas" w:hAnsi="Consolas"/>
+                <w:sz w:val="20"/>
+              </w:rPr>
+              <w:t>plt.plot(neighbors_settings, training_accuracy, label="training accuracy")</w:t>
+            </w:r>
+          </w:p>
+          <w:p>
+            <w:pPr>
+              <w:spacing w:after="0"/>
+            </w:pPr>
+            <w:r>
+              <w:rPr>
+                <w:rFonts w:ascii="Consolas" w:hAnsi="Consolas"/>
+                <w:sz w:val="20"/>
+              </w:rPr>
+              <w:t>plt.plot(neighbors_settings, test_accuracy, label="test accuracy")</w:t>
+            </w:r>
+          </w:p>
+          <w:p>
+            <w:pPr>
+              <w:spacing w:after="0"/>
+            </w:pPr>
+            <w:r>
+              <w:rPr>
+                <w:rFonts w:ascii="Consolas" w:hAnsi="Consolas"/>
+                <w:sz w:val="20"/>
+              </w:rPr>
+              <w:t>plt.ylabel("Accuracy")</w:t>
+            </w:r>
+          </w:p>
+          <w:p>
+            <w:pPr>
+              <w:spacing w:after="0"/>
+            </w:pPr>
+            <w:r>
+              <w:rPr>
+                <w:rFonts w:ascii="Consolas" w:hAnsi="Consolas"/>
+                <w:sz w:val="20"/>
+              </w:rPr>
+              <w:t>plt.xlabel("n_neighbors")</w:t>
+            </w:r>
+          </w:p>
+          <w:p>
+            <w:pPr>
+              <w:spacing w:after="0"/>
+            </w:pPr>
+            <w:r>
+              <w:rPr>
+                <w:rFonts w:ascii="Consolas" w:hAnsi="Consolas"/>
+                <w:sz w:val="20"/>
+              </w:rPr>
+              <w:t>plt.legend()</w:t>
+            </w:r>
+          </w:p>
+        </w:tc>
+      </w:tr>
+    </w:tbl>
+    <w:p>
+      <w:pPr>
+        <w:spacing w:after="40"/>
+      </w:pPr>
+    </w:p>
+    <w:p>
+      <w:pPr>
+        <w:pStyle w:val="Heading2"/>
+      </w:pPr>
+      <w:r>
+        <w:t>Code 5. k-NN Regressor</w:t>
+      </w:r>
+    </w:p>
+    <w:tbl>
+      <w:tblPr>
+        <w:tblStyle w:val="TableGrid"/>
+        <w:tblW w:type="auto" w:w="0"/>
+        <w:tblLook w:firstColumn="1" w:firstRow="1" w:lastColumn="0" w:lastRow="0" w:noHBand="0" w:noVBand="1" w:val="04A0"/>
+      </w:tblPr>
+      <w:tblGrid>
+        <w:gridCol w:w="9360"/>
+      </w:tblGrid>
+      <w:tr>
+        <w:tc>
+          <w:tcPr>
+            <w:tcW w:type="dxa" w:w="9360"/>
+            <w:shd w:val="clear" w:color="auto" w:fill="F5F5F5"/>
+          </w:tcPr>
+          <w:p>
+            <w:r/>
+            <w:r>
+              <w:rPr>
+                <w:b/>
+              </w:rPr>
+              <w:t>Wave data, k = 3, score is R squared</w:t>
+            </w:r>
+          </w:p>
+          <w:p>
+            <w:pPr>
+              <w:spacing w:after="0"/>
+            </w:pPr>
+            <w:r>
+              <w:rPr>
+                <w:rFonts w:ascii="Consolas" w:hAnsi="Consolas"/>
+                <w:sz w:val="20"/>
+              </w:rPr>
+              <w:t>from sklearn.neighbors import KNeighborsRegressor</w:t>
+            </w:r>
+          </w:p>
+          <w:p>
+            <w:pPr>
+              <w:spacing w:after="0"/>
+            </w:pPr>
+            <w:r>
+              <w:rPr>
+                <w:rFonts w:ascii="Consolas" w:hAnsi="Consolas"/>
+                <w:sz w:val="20"/>
+              </w:rPr>
+              <w:t>X, y = mglearn.datasets.make_wave(n_samples=40)</w:t>
+            </w:r>
+          </w:p>
+          <w:p>
+            <w:pPr>
+              <w:spacing w:after="0"/>
+            </w:pPr>
+            <w:r>
+              <w:rPr>
+                <w:rFonts w:ascii="Consolas" w:hAnsi="Consolas"/>
+                <w:sz w:val="20"/>
+              </w:rPr>
+            </w:r>
+          </w:p>
+          <w:p>
+            <w:pPr>
+              <w:spacing w:after="0"/>
+            </w:pPr>
+            <w:r>
+              <w:rPr>
+                <w:rFonts w:ascii="Consolas" w:hAnsi="Consolas"/>
+                <w:sz w:val="20"/>
+              </w:rPr>
+              <w:t># Split dataset</w:t>
+            </w:r>
+          </w:p>
+          <w:p>
+            <w:pPr>
+              <w:spacing w:after="0"/>
+            </w:pPr>
+            <w:r>
+              <w:rPr>
+                <w:rFonts w:ascii="Consolas" w:hAnsi="Consolas"/>
+                <w:sz w:val="20"/>
+              </w:rPr>
+              <w:t>X_train, X_test, y_train, y_test = train_test_split(X, y, random_state=0)</w:t>
+            </w:r>
+          </w:p>
+          <w:p>
+            <w:pPr>
+              <w:spacing w:after="0"/>
+            </w:pPr>
+            <w:r>
+              <w:rPr>
+                <w:rFonts w:ascii="Consolas" w:hAnsi="Consolas"/>
+                <w:sz w:val="20"/>
+              </w:rPr>
+            </w:r>
+          </w:p>
+          <w:p>
+            <w:pPr>
+              <w:spacing w:after="0"/>
+            </w:pPr>
+            <w:r>
+              <w:rPr>
+                <w:rFonts w:ascii="Consolas" w:hAnsi="Consolas"/>
+                <w:sz w:val="20"/>
+              </w:rPr>
+              <w:t># Create model object</w:t>
+            </w:r>
+          </w:p>
+          <w:p>
+            <w:pPr>
+              <w:spacing w:after="0"/>
+            </w:pPr>
+            <w:r>
+              <w:rPr>
+                <w:rFonts w:ascii="Consolas" w:hAnsi="Consolas"/>
+                <w:sz w:val="20"/>
+              </w:rPr>
+              <w:t>reg = KNeighborsRegressor(n_neighbors=3)</w:t>
+            </w:r>
+          </w:p>
+          <w:p>
+            <w:pPr>
+              <w:spacing w:after="0"/>
+            </w:pPr>
+            <w:r>
+              <w:rPr>
+                <w:rFonts w:ascii="Consolas" w:hAnsi="Consolas"/>
+                <w:sz w:val="20"/>
+              </w:rPr>
+            </w:r>
+          </w:p>
+          <w:p>
+            <w:pPr>
+              <w:spacing w:after="0"/>
+            </w:pPr>
+            <w:r>
+              <w:rPr>
+                <w:rFonts w:ascii="Consolas" w:hAnsi="Consolas"/>
+                <w:sz w:val="20"/>
+              </w:rPr>
+              <w:t># Model training</w:t>
+            </w:r>
+          </w:p>
+          <w:p>
+            <w:pPr>
+              <w:spacing w:after="0"/>
+            </w:pPr>
+            <w:r>
+              <w:rPr>
+                <w:rFonts w:ascii="Consolas" w:hAnsi="Consolas"/>
+                <w:sz w:val="20"/>
+              </w:rPr>
+              <w:t>reg.fit(X_train, y_train)</w:t>
+            </w:r>
+          </w:p>
+          <w:p>
+            <w:pPr>
+              <w:spacing w:after="0"/>
+            </w:pPr>
+            <w:r>
+              <w:rPr>
+                <w:rFonts w:ascii="Consolas" w:hAnsi="Consolas"/>
+                <w:sz w:val="20"/>
+              </w:rPr>
+            </w:r>
+          </w:p>
+          <w:p>
+            <w:pPr>
+              <w:spacing w:after="0"/>
+            </w:pPr>
+            <w:r>
+              <w:rPr>
+                <w:rFonts w:ascii="Consolas" w:hAnsi="Consolas"/>
+                <w:sz w:val="20"/>
+              </w:rPr>
+              <w:t>print("Test set predictions:\n{}".format(reg.predict(X_test)))</w:t>
+            </w:r>
+          </w:p>
+          <w:p>
+            <w:pPr>
+              <w:spacing w:after="0"/>
+            </w:pPr>
+            <w:r>
+              <w:rPr>
+                <w:rFonts w:ascii="Consolas" w:hAnsi="Consolas"/>
+                <w:sz w:val="20"/>
+              </w:rPr>
+              <w:t>print("Test set R^2: {:.2f}".format(reg.score(X_test, y_test)))</w:t>
+            </w:r>
+          </w:p>
+        </w:tc>
+      </w:tr>
+    </w:tbl>
+    <w:p>
+      <w:pPr>
+        <w:spacing w:after="40"/>
+      </w:pPr>
+    </w:p>
+    <w:p>
+      <w:pPr>
+        <w:pStyle w:val="Heading2"/>
+      </w:pPr>
+      <w:r>
+        <w:t>Code 6. Linear Regression, Ridge, Lasso</w:t>
+      </w:r>
+    </w:p>
+    <w:tbl>
+      <w:tblPr>
+        <w:tblStyle w:val="TableGrid"/>
+        <w:tblW w:type="auto" w:w="0"/>
+        <w:tblLook w:firstColumn="1" w:firstRow="1" w:lastColumn="0" w:lastRow="0" w:noHBand="0" w:noVBand="1" w:val="04A0"/>
+      </w:tblPr>
+      <w:tblGrid>
+        <w:gridCol w:w="9360"/>
+      </w:tblGrid>
+      <w:tr>
+        <w:tc>
+          <w:tcPr>
+            <w:tcW w:type="dxa" w:w="9360"/>
+            <w:shd w:val="clear" w:color="auto" w:fill="F5F5F5"/>
+          </w:tcPr>
+          <w:p>
+            <w:r/>
+            <w:r>
+              <w:rPr>
+                <w:b/>
+              </w:rPr>
+              <w:t>OLS on wave data</w:t>
+            </w:r>
+          </w:p>
+          <w:p>
+            <w:pPr>
+              <w:spacing w:after="0"/>
+            </w:pPr>
+            <w:r>
+              <w:rPr>
+                <w:rFonts w:ascii="Consolas" w:hAnsi="Consolas"/>
+                <w:sz w:val="20"/>
+              </w:rPr>
+              <w:t>from sklearn.linear_model import LinearRegression</w:t>
+            </w:r>
+          </w:p>
+          <w:p>
+            <w:pPr>
+              <w:spacing w:after="0"/>
+            </w:pPr>
+            <w:r>
+              <w:rPr>
+                <w:rFonts w:ascii="Consolas" w:hAnsi="Consolas"/>
+                <w:sz w:val="20"/>
+              </w:rPr>
+              <w:t>from sklearn.model_selection import train_test_split</w:t>
+            </w:r>
+          </w:p>
+          <w:p>
+            <w:pPr>
+              <w:spacing w:after="0"/>
+            </w:pPr>
+            <w:r>
+              <w:rPr>
+                <w:rFonts w:ascii="Consolas" w:hAnsi="Consolas"/>
+                <w:sz w:val="20"/>
+              </w:rPr>
+              <w:t>import mglearn</w:t>
+            </w:r>
+          </w:p>
+          <w:p>
+            <w:pPr>
+              <w:spacing w:after="0"/>
+            </w:pPr>
+            <w:r>
+              <w:rPr>
+                <w:rFonts w:ascii="Consolas" w:hAnsi="Consolas"/>
+                <w:sz w:val="20"/>
+              </w:rPr>
+            </w:r>
+          </w:p>
+          <w:p>
+            <w:pPr>
+              <w:spacing w:after="0"/>
+            </w:pPr>
+            <w:r>
+              <w:rPr>
+                <w:rFonts w:ascii="Consolas" w:hAnsi="Consolas"/>
+                <w:sz w:val="20"/>
+              </w:rPr>
+              <w:t>X, y = mglearn.datasets.make_wave(n_samples=60)</w:t>
+            </w:r>
+          </w:p>
+          <w:p>
+            <w:pPr>
+              <w:spacing w:after="0"/>
+            </w:pPr>
+            <w:r>
+              <w:rPr>
+                <w:rFonts w:ascii="Consolas" w:hAnsi="Consolas"/>
+                <w:sz w:val="20"/>
+              </w:rPr>
+              <w:t>X_train, X_test, y_train, y_test = train_test_split(X, y, random_state=42)</w:t>
+            </w:r>
+          </w:p>
+          <w:p>
+            <w:pPr>
+              <w:spacing w:after="0"/>
+            </w:pPr>
+            <w:r>
+              <w:rPr>
+                <w:rFonts w:ascii="Consolas" w:hAnsi="Consolas"/>
+                <w:sz w:val="20"/>
+              </w:rPr>
+            </w:r>
+          </w:p>
+          <w:p>
+            <w:pPr>
+              <w:spacing w:after="0"/>
+            </w:pPr>
+            <w:r>
+              <w:rPr>
+                <w:rFonts w:ascii="Consolas" w:hAnsi="Consolas"/>
+                <w:sz w:val="20"/>
+              </w:rPr>
+              <w:t>lr = LinearRegression().fit(X_train, y_train)</w:t>
+            </w:r>
+          </w:p>
+          <w:p>
+            <w:pPr>
+              <w:spacing w:after="0"/>
+            </w:pPr>
+            <w:r>
+              <w:rPr>
+                <w:rFonts w:ascii="Consolas" w:hAnsi="Consolas"/>
+                <w:sz w:val="20"/>
+              </w:rPr>
+            </w:r>
+          </w:p>
+          <w:p>
+            <w:pPr>
+              <w:spacing w:after="0"/>
+            </w:pPr>
+            <w:r>
+              <w:rPr>
+                <w:rFonts w:ascii="Consolas" w:hAnsi="Consolas"/>
+                <w:sz w:val="20"/>
+              </w:rPr>
+              <w:t>print("lr.coef_: {}".format(lr.coef_))</w:t>
+            </w:r>
+          </w:p>
+          <w:p>
+            <w:pPr>
+              <w:spacing w:after="0"/>
+            </w:pPr>
+            <w:r>
+              <w:rPr>
+                <w:rFonts w:ascii="Consolas" w:hAnsi="Consolas"/>
+                <w:sz w:val="20"/>
+              </w:rPr>
+              <w:t>print("lr.intercept_: {}".format(lr.intercept_))</w:t>
+            </w:r>
+          </w:p>
+          <w:p>
+            <w:pPr>
+              <w:spacing w:after="0"/>
+            </w:pPr>
+            <w:r>
+              <w:rPr>
+                <w:rFonts w:ascii="Consolas" w:hAnsi="Consolas"/>
+                <w:sz w:val="20"/>
+              </w:rPr>
+              <w:t>print("Training set score: {:.2f}".format(lr.score(X_train, y_train)))</w:t>
+            </w:r>
+          </w:p>
+          <w:p>
+            <w:pPr>
+              <w:spacing w:after="0"/>
+            </w:pPr>
+            <w:r>
+              <w:rPr>
+                <w:rFonts w:ascii="Consolas" w:hAnsi="Consolas"/>
+                <w:sz w:val="20"/>
+              </w:rPr>
+              <w:t>print("Test set score: {:.2f}".format(lr.score(X_test, y_test)))</w:t>
+            </w:r>
+          </w:p>
+        </w:tc>
+      </w:tr>
+    </w:tbl>
+    <w:p>
+      <w:pPr>
+        <w:spacing w:after="40"/>
+      </w:pPr>
+    </w:p>
+    <w:tbl>
+      <w:tblPr>
+        <w:tblStyle w:val="TableGrid"/>
+        <w:tblW w:type="auto" w:w="0"/>
+        <w:tblLook w:firstColumn="1" w:firstRow="1" w:lastColumn="0" w:lastRow="0" w:noHBand="0" w:noVBand="1" w:val="04A0"/>
+      </w:tblPr>
+      <w:tblGrid>
+        <w:gridCol w:w="9360"/>
+      </w:tblGrid>
+      <w:tr>
+        <w:tc>
+          <w:tcPr>
+            <w:tcW w:type="dxa" w:w="9360"/>
+            <w:shd w:val="clear" w:color="auto" w:fill="F5F5F5"/>
+          </w:tcPr>
+          <w:p>
+            <w:r/>
+            <w:r>
+              <w:rPr>
+                <w:b/>
+              </w:rPr>
+              <w:t>Ridge and Lasso (extended Boston Housing)</w:t>
+            </w:r>
+          </w:p>
+          <w:p>
+            <w:pPr>
+              <w:spacing w:after="0"/>
+            </w:pPr>
+            <w:r>
+              <w:rPr>
+                <w:rFonts w:ascii="Consolas" w:hAnsi="Consolas"/>
+                <w:sz w:val="20"/>
+              </w:rPr>
+              <w:t>from sklearn.linear_model import Ridge</w:t>
+            </w:r>
+          </w:p>
+          <w:p>
+            <w:pPr>
+              <w:spacing w:after="0"/>
+            </w:pPr>
+            <w:r>
+              <w:rPr>
+                <w:rFonts w:ascii="Consolas" w:hAnsi="Consolas"/>
+                <w:sz w:val="20"/>
+              </w:rPr>
+              <w:t>ridge = Ridge().fit(X_train, y_train)</w:t>
+            </w:r>
+          </w:p>
+          <w:p>
+            <w:pPr>
+              <w:spacing w:after="0"/>
+            </w:pPr>
+            <w:r>
+              <w:rPr>
+                <w:rFonts w:ascii="Consolas" w:hAnsi="Consolas"/>
+                <w:sz w:val="20"/>
+              </w:rPr>
+              <w:t>print("Training set score: {:.2f}".format(ridge.score(X_train, y_train)))</w:t>
+            </w:r>
+          </w:p>
+          <w:p>
+            <w:pPr>
+              <w:spacing w:after="0"/>
+            </w:pPr>
+            <w:r>
+              <w:rPr>
+                <w:rFonts w:ascii="Consolas" w:hAnsi="Consolas"/>
+                <w:sz w:val="20"/>
+              </w:rPr>
+              <w:t>print("Test set score: {:.2f}".format(ridge.score(X_test, y_test)))</w:t>
+            </w:r>
+          </w:p>
+          <w:p>
+            <w:pPr>
+              <w:spacing w:after="0"/>
+            </w:pPr>
+            <w:r>
+              <w:rPr>
+                <w:rFonts w:ascii="Consolas" w:hAnsi="Consolas"/>
+                <w:sz w:val="20"/>
+              </w:rPr>
+            </w:r>
+          </w:p>
+          <w:p>
+            <w:pPr>
+              <w:spacing w:after="0"/>
+            </w:pPr>
+            <w:r>
+              <w:rPr>
+                <w:rFonts w:ascii="Consolas" w:hAnsi="Consolas"/>
+                <w:sz w:val="20"/>
+              </w:rPr>
+              <w:t>from sklearn.linear_model import Lasso</w:t>
+            </w:r>
+          </w:p>
+          <w:p>
+            <w:pPr>
+              <w:spacing w:after="0"/>
+            </w:pPr>
+            <w:r>
+              <w:rPr>
+                <w:rFonts w:ascii="Consolas" w:hAnsi="Consolas"/>
+                <w:sz w:val="20"/>
+              </w:rPr>
+              <w:t>import numpy as np</w:t>
+            </w:r>
+          </w:p>
+          <w:p>
+            <w:pPr>
+              <w:spacing w:after="0"/>
+            </w:pPr>
+            <w:r>
+              <w:rPr>
+                <w:rFonts w:ascii="Consolas" w:hAnsi="Consolas"/>
+                <w:sz w:val="20"/>
+              </w:rPr>
+              <w:t>lasso = Lasso().fit(X_train, y_train)</w:t>
+            </w:r>
+          </w:p>
+          <w:p>
+            <w:pPr>
+              <w:spacing w:after="0"/>
+            </w:pPr>
+            <w:r>
+              <w:rPr>
+                <w:rFonts w:ascii="Consolas" w:hAnsi="Consolas"/>
+                <w:sz w:val="20"/>
+              </w:rPr>
+              <w:t>lasso001 = Lasso(alpha=0.01, max_iter=100000).fit(X_train, y_train)</w:t>
+            </w:r>
+          </w:p>
+          <w:p>
+            <w:pPr>
+              <w:spacing w:after="0"/>
+            </w:pPr>
+            <w:r>
+              <w:rPr>
+                <w:rFonts w:ascii="Consolas" w:hAnsi="Consolas"/>
+                <w:sz w:val="20"/>
+              </w:rPr>
+              <w:t>lasso00001 = Lasso(alpha=0.0001, max_iter=100000).fit(X_train, y_train)</w:t>
+            </w:r>
+          </w:p>
+          <w:p>
+            <w:pPr>
+              <w:spacing w:after="0"/>
+            </w:pPr>
+            <w:r>
+              <w:rPr>
+                <w:rFonts w:ascii="Consolas" w:hAnsi="Consolas"/>
+                <w:sz w:val="20"/>
+              </w:rPr>
+            </w:r>
+          </w:p>
+          <w:p>
+            <w:pPr>
+              <w:spacing w:after="0"/>
+            </w:pPr>
+            <w:r>
+              <w:rPr>
+                <w:rFonts w:ascii="Consolas" w:hAnsi="Consolas"/>
+                <w:sz w:val="20"/>
+              </w:rPr>
+              <w:t>plt.plot(ridge.coef_, 's', label="Ridge alpha=1")</w:t>
+            </w:r>
+          </w:p>
+          <w:p>
+            <w:pPr>
+              <w:spacing w:after="0"/>
+            </w:pPr>
+            <w:r>
+              <w:rPr>
+                <w:rFonts w:ascii="Consolas" w:hAnsi="Consolas"/>
+                <w:sz w:val="20"/>
+              </w:rPr>
+              <w:t>plt.plot(lasso.coef_, 's', label="Lasso alpha=1")</w:t>
+            </w:r>
+          </w:p>
+        </w:tc>
+      </w:tr>
+    </w:tbl>
+    <w:p>
+      <w:pPr>
+        <w:spacing w:after="40"/>
+      </w:pPr>
+    </w:p>
+    <w:p>
+      <w:pPr>
+        <w:pStyle w:val="ListBullet"/>
+      </w:pPr>
+      <w:r>
+        <w:rPr>
+          <w:b w:val="0"/>
+        </w:rPr>
+        <w:t xml:space="preserve">Ridge default </w:t>
+      </w:r>
+      <w:r>
+        <w:rPr>
+          <w:b/>
+        </w:rPr>
+        <w:t>alpha=1.0</w:t>
+      </w:r>
+      <w:r>
+        <w:rPr>
+          <w:b w:val="0"/>
+        </w:rPr>
+        <w:t xml:space="preserve">. The slides also try </w:t>
+      </w:r>
+      <w:r>
+        <w:rPr>
+          <w:b/>
+        </w:rPr>
+        <w:t>alpha=10</w:t>
+      </w:r>
+      <w:r>
+        <w:rPr>
+          <w:b w:val="0"/>
+        </w:rPr>
+        <w:t xml:space="preserve"> (high penalty) and </w:t>
+      </w:r>
+      <w:r>
+        <w:rPr>
+          <w:b/>
+        </w:rPr>
+        <w:t>alpha=0.1</w:t>
+      </w:r>
+      <w:r>
+        <w:rPr>
+          <w:b w:val="0"/>
+        </w:rPr>
+        <w:t xml:space="preserve"> (low penalty).</w:t>
+      </w:r>
+    </w:p>
+    <w:p>
+      <w:pPr>
+        <w:pStyle w:val="ListBullet"/>
+      </w:pPr>
+      <w:r>
+        <w:rPr>
+          <w:b w:val="0"/>
+        </w:rPr>
+        <w:t xml:space="preserve">Lasso default </w:t>
+      </w:r>
+      <w:r>
+        <w:rPr>
+          <w:b/>
+        </w:rPr>
+        <w:t>alpha=1.0, max_iter=1000</w:t>
+      </w:r>
+      <w:r>
+        <w:rPr>
+          <w:b w:val="0"/>
+        </w:rPr>
+        <w:t xml:space="preserve"> underfits (</w:t>
+      </w:r>
+      <w:r>
+        <w:rPr>
+          <w:b/>
+        </w:rPr>
+        <w:t>4 of 105 features</w:t>
+      </w:r>
+      <w:r>
+        <w:rPr>
+          <w:b w:val="0"/>
+        </w:rPr>
+        <w:t xml:space="preserve"> used). </w:t>
+      </w:r>
+      <w:r>
+        <w:rPr>
+          <w:b/>
+        </w:rPr>
+        <w:t>alpha=0.01</w:t>
+      </w:r>
+      <w:r>
+        <w:rPr>
+          <w:b w:val="0"/>
+        </w:rPr>
+        <w:t xml:space="preserve"> with </w:t>
+      </w:r>
+      <w:r>
+        <w:rPr>
+          <w:b/>
+        </w:rPr>
+        <w:t>max_iter=100000</w:t>
+      </w:r>
+      <w:r>
+        <w:rPr>
+          <w:b w:val="0"/>
+        </w:rPr>
+        <w:t xml:space="preserve"> works well. </w:t>
+      </w:r>
+      <w:r>
+        <w:rPr>
+          <w:b/>
+        </w:rPr>
+        <w:t>alpha=0.0001</w:t>
+      </w:r>
+      <w:r>
+        <w:rPr>
+          <w:b w:val="0"/>
+        </w:rPr>
+        <w:t xml:space="preserve"> overfits (</w:t>
+      </w:r>
+      <w:r>
+        <w:rPr>
+          <w:b/>
+        </w:rPr>
+        <w:t>96 of 105 features</w:t>
+      </w:r>
+      <w:r>
+        <w:rPr>
+          <w:b w:val="0"/>
+        </w:rPr>
+        <w:t>, close to plain OLS).</w:t>
+      </w:r>
+    </w:p>
+    <w:p>
+      <w:pPr>
+        <w:pStyle w:val="ListBullet"/>
+      </w:pPr>
+      <w:r>
+        <w:rPr>
+          <w:b/>
+        </w:rPr>
+        <w:t>max_iter</w:t>
+      </w:r>
+      <w:r>
+        <w:rPr>
+          <w:b w:val="0"/>
+        </w:rPr>
+        <w:t xml:space="preserve"> has to go up when alpha goes down, otherwise Lasso warns it did not converge.</w:t>
+      </w:r>
+    </w:p>
+    <w:p>
+      <w:pPr>
+        <w:pStyle w:val="Heading2"/>
+      </w:pPr>
+      <w:r>
+        <w:t>Code 7. Logistic Regression and LinearSVC</w:t>
+      </w:r>
+    </w:p>
+    <w:tbl>
+      <w:tblPr>
+        <w:tblStyle w:val="TableGrid"/>
+        <w:tblW w:type="auto" w:w="0"/>
+        <w:tblLook w:firstColumn="1" w:firstRow="1" w:lastColumn="0" w:lastRow="0" w:noHBand="0" w:noVBand="1" w:val="04A0"/>
+      </w:tblPr>
+      <w:tblGrid>
+        <w:gridCol w:w="9360"/>
+      </w:tblGrid>
+      <w:tr>
+        <w:tc>
+          <w:tcPr>
+            <w:tcW w:type="dxa" w:w="9360"/>
+            <w:shd w:val="clear" w:color="auto" w:fill="F5F5F5"/>
+          </w:tcPr>
+          <w:p>
+            <w:r/>
+            <w:r>
+              <w:rPr>
+                <w:b/>
+              </w:rPr>
+              <w:t>Two linear classifiers, then logistic regression on breast cancer</w:t>
+            </w:r>
+          </w:p>
+          <w:p>
+            <w:pPr>
+              <w:spacing w:after="0"/>
+            </w:pPr>
+            <w:r>
+              <w:rPr>
+                <w:rFonts w:ascii="Consolas" w:hAnsi="Consolas"/>
+                <w:sz w:val="20"/>
+              </w:rPr>
+              <w:t>from sklearn.linear_model import LogisticRegression</w:t>
+            </w:r>
+          </w:p>
+          <w:p>
+            <w:pPr>
+              <w:spacing w:after="0"/>
+            </w:pPr>
+            <w:r>
+              <w:rPr>
+                <w:rFonts w:ascii="Consolas" w:hAnsi="Consolas"/>
+                <w:sz w:val="20"/>
+              </w:rPr>
+              <w:t>from sklearn.svm import LinearSVC</w:t>
+            </w:r>
+          </w:p>
+          <w:p>
+            <w:pPr>
+              <w:spacing w:after="0"/>
+            </w:pPr>
+            <w:r>
+              <w:rPr>
+                <w:rFonts w:ascii="Consolas" w:hAnsi="Consolas"/>
+                <w:sz w:val="20"/>
+              </w:rPr>
+              <w:t>import matplotlib.pyplot as plt</w:t>
+            </w:r>
+          </w:p>
+          <w:p>
+            <w:pPr>
+              <w:spacing w:after="0"/>
+            </w:pPr>
+            <w:r>
+              <w:rPr>
+                <w:rFonts w:ascii="Consolas" w:hAnsi="Consolas"/>
+                <w:sz w:val="20"/>
+              </w:rPr>
+              <w:t>import mglearn</w:t>
+            </w:r>
+          </w:p>
+          <w:p>
+            <w:pPr>
+              <w:spacing w:after="0"/>
+            </w:pPr>
+            <w:r>
+              <w:rPr>
+                <w:rFonts w:ascii="Consolas" w:hAnsi="Consolas"/>
+                <w:sz w:val="20"/>
+              </w:rPr>
+            </w:r>
+          </w:p>
+          <w:p>
+            <w:pPr>
+              <w:spacing w:after="0"/>
+            </w:pPr>
+            <w:r>
+              <w:rPr>
+                <w:rFonts w:ascii="Consolas" w:hAnsi="Consolas"/>
+                <w:sz w:val="20"/>
+              </w:rPr>
+              <w:t>for model, ax in zip([LinearSVC(), LogisticRegression()], axes):</w:t>
+            </w:r>
+          </w:p>
+          <w:p>
+            <w:pPr>
+              <w:spacing w:after="0"/>
+            </w:pPr>
+            <w:r>
+              <w:rPr>
+                <w:rFonts w:ascii="Consolas" w:hAnsi="Consolas"/>
+                <w:sz w:val="20"/>
+              </w:rPr>
+              <w:t xml:space="preserve">    clf = model.fit(X, y)</w:t>
+            </w:r>
+          </w:p>
+          <w:p>
+            <w:pPr>
+              <w:spacing w:after="0"/>
+            </w:pPr>
+            <w:r>
+              <w:rPr>
+                <w:rFonts w:ascii="Consolas" w:hAnsi="Consolas"/>
+                <w:sz w:val="20"/>
+              </w:rPr>
+              <w:t xml:space="preserve">    mglearn.plots.plot_2d_separator(clf, X, fill=False, eps=0.5, ax=ax, alpha=.7)</w:t>
+            </w:r>
+          </w:p>
+          <w:p>
+            <w:pPr>
+              <w:spacing w:after="0"/>
+            </w:pPr>
+            <w:r>
+              <w:rPr>
+                <w:rFonts w:ascii="Consolas" w:hAnsi="Consolas"/>
+                <w:sz w:val="20"/>
+              </w:rPr>
+            </w:r>
+          </w:p>
+          <w:p>
+            <w:pPr>
+              <w:spacing w:after="0"/>
+            </w:pPr>
+            <w:r>
+              <w:rPr>
+                <w:rFonts w:ascii="Consolas" w:hAnsi="Consolas"/>
+                <w:sz w:val="20"/>
+              </w:rPr>
+              <w:t>cancer = load_breast_cancer()</w:t>
+            </w:r>
+          </w:p>
+          <w:p>
+            <w:pPr>
+              <w:spacing w:after="0"/>
+            </w:pPr>
+            <w:r>
+              <w:rPr>
+                <w:rFonts w:ascii="Consolas" w:hAnsi="Consolas"/>
+                <w:sz w:val="20"/>
+              </w:rPr>
+              <w:t>X_train, X_test, y_train, y_test = train_test_split(</w:t>
+            </w:r>
+          </w:p>
+          <w:p>
+            <w:pPr>
+              <w:spacing w:after="0"/>
+            </w:pPr>
+            <w:r>
+              <w:rPr>
+                <w:rFonts w:ascii="Consolas" w:hAnsi="Consolas"/>
+                <w:sz w:val="20"/>
+              </w:rPr>
+              <w:t xml:space="preserve">    cancer.data, cancer.target, stratify=cancer.target, random_state=42)</w:t>
+            </w:r>
+          </w:p>
+          <w:p>
+            <w:pPr>
+              <w:spacing w:after="0"/>
+            </w:pPr>
+            <w:r>
+              <w:rPr>
+                <w:rFonts w:ascii="Consolas" w:hAnsi="Consolas"/>
+                <w:sz w:val="20"/>
+              </w:rPr>
+              <w:t>logreg = LogisticRegression().fit(X_train, y_train)</w:t>
+            </w:r>
+          </w:p>
+          <w:p>
+            <w:pPr>
+              <w:spacing w:after="0"/>
+            </w:pPr>
+            <w:r>
+              <w:rPr>
+                <w:rFonts w:ascii="Consolas" w:hAnsi="Consolas"/>
+                <w:sz w:val="20"/>
+              </w:rPr>
+            </w:r>
+          </w:p>
+          <w:p>
+            <w:pPr>
+              <w:spacing w:after="0"/>
+            </w:pPr>
+            <w:r>
+              <w:rPr>
+                <w:rFonts w:ascii="Consolas" w:hAnsi="Consolas"/>
+                <w:sz w:val="20"/>
+              </w:rPr>
+              <w:t>logreg100 = LogisticRegression(C=100).fit(X_train, y_train)</w:t>
+            </w:r>
+          </w:p>
+          <w:p>
+            <w:pPr>
+              <w:spacing w:after="0"/>
+            </w:pPr>
+            <w:r>
+              <w:rPr>
+                <w:rFonts w:ascii="Consolas" w:hAnsi="Consolas"/>
+                <w:sz w:val="20"/>
+              </w:rPr>
+              <w:t>logreg001 = LogisticRegression(C=0.01).fit(X_train, y_train)</w:t>
+            </w:r>
+          </w:p>
+          <w:p>
+            <w:pPr>
+              <w:spacing w:after="0"/>
+            </w:pPr>
+            <w:r>
+              <w:rPr>
+                <w:rFonts w:ascii="Consolas" w:hAnsi="Consolas"/>
+                <w:sz w:val="20"/>
+              </w:rPr>
+            </w:r>
+          </w:p>
+          <w:p>
+            <w:pPr>
+              <w:spacing w:after="0"/>
+            </w:pPr>
+            <w:r>
+              <w:rPr>
+                <w:rFonts w:ascii="Consolas" w:hAnsi="Consolas"/>
+                <w:sz w:val="20"/>
+              </w:rPr>
+              <w:t>lr_l1 = LogisticRegression(C=C, penalty="l1", solver='liblinear').fit(X_train, y_train)</w:t>
+            </w:r>
+          </w:p>
+          <w:p>
+            <w:pPr>
+              <w:spacing w:after="0"/>
+            </w:pPr>
+            <w:r>
+              <w:rPr>
+                <w:rFonts w:ascii="Consolas" w:hAnsi="Consolas"/>
+                <w:sz w:val="20"/>
+              </w:rPr>
+              <w:t>print("Test accuracy of l1 logreg with C={:.3f}: {:.2f}".format(</w:t>
+            </w:r>
+          </w:p>
+          <w:p>
+            <w:pPr>
+              <w:spacing w:after="0"/>
+            </w:pPr>
+            <w:r>
+              <w:rPr>
+                <w:rFonts w:ascii="Consolas" w:hAnsi="Consolas"/>
+                <w:sz w:val="20"/>
+              </w:rPr>
+              <w:t xml:space="preserve">    C, lr_l1.score(X_test, y_test)))</w:t>
+            </w:r>
+          </w:p>
+        </w:tc>
+      </w:tr>
+    </w:tbl>
+    <w:p>
+      <w:pPr>
+        <w:spacing w:after="40"/>
+      </w:pPr>
+    </w:p>
+    <w:p>
+      <w:pPr>
+        <w:pStyle w:val="ListBullet"/>
+      </w:pPr>
+      <w:r>
+        <w:rPr>
+          <w:b w:val="0"/>
+        </w:rPr>
+        <w:t xml:space="preserve">Default </w:t>
+      </w:r>
+      <w:r>
+        <w:rPr>
+          <w:b/>
+        </w:rPr>
+        <w:t>C=1.0</w:t>
+      </w:r>
+      <w:r>
+        <w:rPr>
+          <w:b w:val="0"/>
+        </w:rPr>
+        <w:t xml:space="preserve"> with an </w:t>
+      </w:r>
+      <w:r>
+        <w:rPr>
+          <w:b/>
+        </w:rPr>
+        <w:t>L2</w:t>
+      </w:r>
+      <w:r>
+        <w:rPr>
+          <w:b w:val="0"/>
+        </w:rPr>
+        <w:t xml:space="preserve"> penalty. Default scores: training </w:t>
+      </w:r>
+      <w:r>
+        <w:rPr>
+          <w:b/>
+        </w:rPr>
+        <w:t>0.948</w:t>
+      </w:r>
+      <w:r>
+        <w:rPr>
+          <w:b w:val="0"/>
+        </w:rPr>
+        <w:t xml:space="preserve">, test </w:t>
+      </w:r>
+      <w:r>
+        <w:rPr>
+          <w:b/>
+        </w:rPr>
+        <w:t>0.944</w:t>
+      </w:r>
+      <w:r>
+        <w:rPr>
+          <w:b w:val="0"/>
+        </w:rPr>
+        <w:t xml:space="preserve">. </w:t>
+      </w:r>
+      <w:r>
+        <w:rPr>
+          <w:b/>
+        </w:rPr>
+        <w:t>C=100</w:t>
+      </w:r>
+      <w:r>
+        <w:rPr>
+          <w:b w:val="0"/>
+        </w:rPr>
+        <w:t xml:space="preserve"> = weaker regularization; </w:t>
+      </w:r>
+      <w:r>
+        <w:rPr>
+          <w:b/>
+        </w:rPr>
+        <w:t>C=0.01</w:t>
+      </w:r>
+      <w:r>
+        <w:rPr>
+          <w:b w:val="0"/>
+        </w:rPr>
+        <w:t xml:space="preserve"> = stronger.</w:t>
+      </w:r>
+    </w:p>
+    <w:p>
+      <w:pPr>
+        <w:pStyle w:val="ListBullet"/>
+      </w:pPr>
+      <w:r>
+        <w:rPr>
+          <w:b/>
+        </w:rPr>
+        <w:t>penalty="l1"</w:t>
+      </w:r>
+      <w:r>
+        <w:rPr>
+          <w:b w:val="0"/>
+        </w:rPr>
+        <w:t xml:space="preserve"> needs </w:t>
+      </w:r>
+      <w:r>
+        <w:rPr>
+          <w:b/>
+        </w:rPr>
+        <w:t>solver='liblinear'</w:t>
+      </w:r>
+      <w:r>
+        <w:rPr>
+          <w:b w:val="0"/>
+        </w:rPr>
+        <w:t xml:space="preserve"> and gives sparse coefficients (an easier model to read).</w:t>
+      </w:r>
+    </w:p>
+    <w:p>
+      <w:pPr>
+        <w:pStyle w:val="Heading2"/>
+      </w:pPr>
+      <w:r>
+        <w:t>Code 8. Trees, Random Forest, Gradient Boosting</w:t>
+      </w:r>
+    </w:p>
+    <w:tbl>
+      <w:tblPr>
+        <w:tblStyle w:val="TableGrid"/>
+        <w:tblW w:type="auto" w:w="0"/>
+        <w:tblLook w:firstColumn="1" w:firstRow="1" w:lastColumn="0" w:lastRow="0" w:noHBand="0" w:noVBand="1" w:val="04A0"/>
+      </w:tblPr>
+      <w:tblGrid>
+        <w:gridCol w:w="9360"/>
+      </w:tblGrid>
+      <w:tr>
+        <w:tc>
+          <w:tcPr>
+            <w:tcW w:type="dxa" w:w="9360"/>
+            <w:shd w:val="clear" w:color="auto" w:fill="F5F5F5"/>
+          </w:tcPr>
+          <w:p>
+            <w:r/>
+            <w:r>
+              <w:rPr>
+                <w:b/>
+              </w:rPr>
+              <w:t>Decision tree on breast cancer</w:t>
+            </w:r>
+          </w:p>
+          <w:p>
+            <w:pPr>
+              <w:spacing w:after="0"/>
+            </w:pPr>
+            <w:r>
+              <w:rPr>
+                <w:rFonts w:ascii="Consolas" w:hAnsi="Consolas"/>
+                <w:sz w:val="20"/>
+              </w:rPr>
+              <w:t>from sklearn.tree import DecisionTreeClassifier</w:t>
+            </w:r>
+          </w:p>
+          <w:p>
+            <w:pPr>
+              <w:spacing w:after="0"/>
+            </w:pPr>
+            <w:r>
+              <w:rPr>
+                <w:rFonts w:ascii="Consolas" w:hAnsi="Consolas"/>
+                <w:sz w:val="20"/>
+              </w:rPr>
+              <w:t>X_train, X_test, y_train, y_test = train_test_split(</w:t>
+            </w:r>
+          </w:p>
+          <w:p>
+            <w:pPr>
+              <w:spacing w:after="0"/>
+            </w:pPr>
+            <w:r>
+              <w:rPr>
+                <w:rFonts w:ascii="Consolas" w:hAnsi="Consolas"/>
+                <w:sz w:val="20"/>
+              </w:rPr>
+              <w:t xml:space="preserve">    cancer.data, cancer.target, stratify=cancer.target, random_state=42)</w:t>
+            </w:r>
+          </w:p>
+          <w:p>
+            <w:pPr>
+              <w:spacing w:after="0"/>
+            </w:pPr>
+            <w:r>
+              <w:rPr>
+                <w:rFonts w:ascii="Consolas" w:hAnsi="Consolas"/>
+                <w:sz w:val="20"/>
+              </w:rPr>
+              <w:t>tree = DecisionTreeClassifier(random_state=0)</w:t>
+            </w:r>
+          </w:p>
+          <w:p>
+            <w:pPr>
+              <w:spacing w:after="0"/>
+            </w:pPr>
+            <w:r>
+              <w:rPr>
+                <w:rFonts w:ascii="Consolas" w:hAnsi="Consolas"/>
+                <w:sz w:val="20"/>
+              </w:rPr>
+              <w:t>tree.fit(X_train, y_train)</w:t>
+            </w:r>
+          </w:p>
+          <w:p>
+            <w:pPr>
+              <w:spacing w:after="0"/>
+            </w:pPr>
+            <w:r>
+              <w:rPr>
+                <w:rFonts w:ascii="Consolas" w:hAnsi="Consolas"/>
+                <w:sz w:val="20"/>
+              </w:rPr>
+              <w:t>print("Accuracy on training set: {:.3f}".format(tree.score(X_train, y_train)))</w:t>
+            </w:r>
+          </w:p>
+          <w:p>
+            <w:pPr>
+              <w:spacing w:after="0"/>
+            </w:pPr>
+            <w:r>
+              <w:rPr>
+                <w:rFonts w:ascii="Consolas" w:hAnsi="Consolas"/>
+                <w:sz w:val="20"/>
+              </w:rPr>
+              <w:t>print("Accuracy on test set: {:.3f}".format(tree.score(X_test, y_test)))</w:t>
+            </w:r>
+          </w:p>
+          <w:p>
+            <w:pPr>
+              <w:spacing w:after="0"/>
+            </w:pPr>
+            <w:r>
+              <w:rPr>
+                <w:rFonts w:ascii="Consolas" w:hAnsi="Consolas"/>
+                <w:sz w:val="20"/>
+              </w:rPr>
+            </w:r>
+          </w:p>
+          <w:p>
+            <w:pPr>
+              <w:spacing w:after="0"/>
+            </w:pPr>
+            <w:r>
+              <w:rPr>
+                <w:rFonts w:ascii="Consolas" w:hAnsi="Consolas"/>
+                <w:sz w:val="20"/>
+              </w:rPr>
+              <w:t># pre-pruning</w:t>
+            </w:r>
+          </w:p>
+          <w:p>
+            <w:pPr>
+              <w:spacing w:after="0"/>
+            </w:pPr>
+            <w:r>
+              <w:rPr>
+                <w:rFonts w:ascii="Consolas" w:hAnsi="Consolas"/>
+                <w:sz w:val="20"/>
+              </w:rPr>
+              <w:t>tree = DecisionTreeClassifier(max_depth=4, random_state=0)</w:t>
+            </w:r>
+          </w:p>
+          <w:p>
+            <w:pPr>
+              <w:spacing w:after="0"/>
+            </w:pPr>
+            <w:r>
+              <w:rPr>
+                <w:rFonts w:ascii="Consolas" w:hAnsi="Consolas"/>
+                <w:sz w:val="20"/>
+              </w:rPr>
+              <w:t>tree.fit(X_train, y_train)</w:t>
+            </w:r>
+          </w:p>
+        </w:tc>
+      </w:tr>
+    </w:tbl>
+    <w:p>
+      <w:pPr>
+        <w:spacing w:after="40"/>
+      </w:pPr>
+    </w:p>
+    <w:tbl>
+      <w:tblPr>
+        <w:tblStyle w:val="TableGrid"/>
+        <w:tblW w:type="auto" w:w="0"/>
+        <w:tblLook w:firstColumn="1" w:firstRow="1" w:lastColumn="0" w:lastRow="0" w:noHBand="0" w:noVBand="1" w:val="04A0"/>
+      </w:tblPr>
+      <w:tblGrid>
+        <w:gridCol w:w="9360"/>
+      </w:tblGrid>
+      <w:tr>
+        <w:tc>
+          <w:tcPr>
+            <w:tcW w:type="dxa" w:w="9360"/>
+            <w:shd w:val="clear" w:color="auto" w:fill="F5F5F5"/>
+          </w:tcPr>
+          <w:p>
+            <w:r/>
+            <w:r>
+              <w:rPr>
+                <w:b/>
+              </w:rPr>
+              <w:t>Export and view the tree</w:t>
+            </w:r>
+          </w:p>
+          <w:p>
+            <w:pPr>
+              <w:spacing w:after="0"/>
+            </w:pPr>
+            <w:r>
+              <w:rPr>
+                <w:rFonts w:ascii="Consolas" w:hAnsi="Consolas"/>
+                <w:sz w:val="20"/>
+              </w:rPr>
+              <w:t>from sklearn.tree import export_graphviz</w:t>
+            </w:r>
+          </w:p>
+          <w:p>
+            <w:pPr>
+              <w:spacing w:after="0"/>
+            </w:pPr>
+            <w:r>
+              <w:rPr>
+                <w:rFonts w:ascii="Consolas" w:hAnsi="Consolas"/>
+                <w:sz w:val="20"/>
+              </w:rPr>
+              <w:t>export_graphviz(tree, out_file="tree.dot", class_names=["malignant", "benign"],</w:t>
+            </w:r>
+          </w:p>
+          <w:p>
+            <w:pPr>
+              <w:spacing w:after="0"/>
+            </w:pPr>
+            <w:r>
+              <w:rPr>
+                <w:rFonts w:ascii="Consolas" w:hAnsi="Consolas"/>
+                <w:sz w:val="20"/>
+              </w:rPr>
+              <w:t xml:space="preserve">                feature_names=cancer.feature_names, impurity=False, filled=True)</w:t>
+            </w:r>
+          </w:p>
+          <w:p>
+            <w:pPr>
+              <w:spacing w:after="0"/>
+            </w:pPr>
+            <w:r>
+              <w:rPr>
+                <w:rFonts w:ascii="Consolas" w:hAnsi="Consolas"/>
+                <w:sz w:val="20"/>
+              </w:rPr>
+            </w:r>
+          </w:p>
+          <w:p>
+            <w:pPr>
+              <w:spacing w:after="0"/>
+            </w:pPr>
+            <w:r>
+              <w:rPr>
+                <w:rFonts w:ascii="Consolas" w:hAnsi="Consolas"/>
+                <w:sz w:val="20"/>
+              </w:rPr>
+              <w:t>import graphviz</w:t>
+            </w:r>
+          </w:p>
+          <w:p>
+            <w:pPr>
+              <w:spacing w:after="0"/>
+            </w:pPr>
+            <w:r>
+              <w:rPr>
+                <w:rFonts w:ascii="Consolas" w:hAnsi="Consolas"/>
+                <w:sz w:val="20"/>
+              </w:rPr>
+            </w:r>
+          </w:p>
+          <w:p>
+            <w:pPr>
+              <w:spacing w:after="0"/>
+            </w:pPr>
+            <w:r>
+              <w:rPr>
+                <w:rFonts w:ascii="Consolas" w:hAnsi="Consolas"/>
+                <w:sz w:val="20"/>
+              </w:rPr>
+              <w:t>with open("tree.dot") as f:</w:t>
+            </w:r>
+          </w:p>
+          <w:p>
+            <w:pPr>
+              <w:spacing w:after="0"/>
+            </w:pPr>
+            <w:r>
+              <w:rPr>
+                <w:rFonts w:ascii="Consolas" w:hAnsi="Consolas"/>
+                <w:sz w:val="20"/>
+              </w:rPr>
+              <w:t xml:space="preserve">    dot_graph = f.read()</w:t>
+            </w:r>
+          </w:p>
+          <w:p>
+            <w:pPr>
+              <w:spacing w:after="0"/>
+            </w:pPr>
+            <w:r>
+              <w:rPr>
+                <w:rFonts w:ascii="Consolas" w:hAnsi="Consolas"/>
+                <w:sz w:val="20"/>
+              </w:rPr>
+              <w:t>graphviz.Source(dot_graph)</w:t>
+            </w:r>
+          </w:p>
+        </w:tc>
+      </w:tr>
+    </w:tbl>
+    <w:p>
+      <w:pPr>
+        <w:spacing w:after="40"/>
+      </w:pPr>
+    </w:p>
+    <w:tbl>
+      <w:tblPr>
+        <w:tblStyle w:val="TableGrid"/>
+        <w:tblW w:type="auto" w:w="0"/>
+        <w:tblLook w:firstColumn="1" w:firstRow="1" w:lastColumn="0" w:lastRow="0" w:noHBand="0" w:noVBand="1" w:val="04A0"/>
+      </w:tblPr>
+      <w:tblGrid>
+        <w:gridCol w:w="9360"/>
+      </w:tblGrid>
+      <w:tr>
+        <w:tc>
+          <w:tcPr>
+            <w:tcW w:type="dxa" w:w="9360"/>
+            <w:shd w:val="clear" w:color="auto" w:fill="F5F5F5"/>
+          </w:tcPr>
+          <w:p>
+            <w:r/>
+            <w:r>
+              <w:rPr>
+                <w:b/>
+              </w:rPr>
+              <w:t>Tree regressor vs linear regression (RAM prices)</w:t>
+            </w:r>
+          </w:p>
+          <w:p>
+            <w:pPr>
+              <w:spacing w:after="0"/>
+            </w:pPr>
+            <w:r>
+              <w:rPr>
+                <w:rFonts w:ascii="Consolas" w:hAnsi="Consolas"/>
+                <w:sz w:val="20"/>
+              </w:rPr>
+              <w:t>from sklearn.tree import DecisionTreeRegressor</w:t>
+            </w:r>
+          </w:p>
+          <w:p>
+            <w:pPr>
+              <w:spacing w:after="0"/>
+            </w:pPr>
+            <w:r>
+              <w:rPr>
+                <w:rFonts w:ascii="Consolas" w:hAnsi="Consolas"/>
+                <w:sz w:val="20"/>
+              </w:rPr>
+              <w:t>data_train = ram_prices[ram_prices.date &lt; 2000]</w:t>
+            </w:r>
+          </w:p>
+          <w:p>
+            <w:pPr>
+              <w:spacing w:after="0"/>
+            </w:pPr>
+            <w:r>
+              <w:rPr>
+                <w:rFonts w:ascii="Consolas" w:hAnsi="Consolas"/>
+                <w:sz w:val="20"/>
+              </w:rPr>
+              <w:t>data_test = ram_prices[ram_prices.date &gt;= 2000]</w:t>
+            </w:r>
+          </w:p>
+          <w:p>
+            <w:pPr>
+              <w:spacing w:after="0"/>
+            </w:pPr>
+            <w:r>
+              <w:rPr>
+                <w:rFonts w:ascii="Consolas" w:hAnsi="Consolas"/>
+                <w:sz w:val="20"/>
+              </w:rPr>
+            </w:r>
+          </w:p>
+          <w:p>
+            <w:pPr>
+              <w:spacing w:after="0"/>
+            </w:pPr>
+            <w:r>
+              <w:rPr>
+                <w:rFonts w:ascii="Consolas" w:hAnsi="Consolas"/>
+                <w:sz w:val="20"/>
+              </w:rPr>
+              <w:t>X_train = data_train.date[:, np.newaxis]</w:t>
+            </w:r>
+          </w:p>
+          <w:p>
+            <w:pPr>
+              <w:spacing w:after="0"/>
+            </w:pPr>
+            <w:r>
+              <w:rPr>
+                <w:rFonts w:ascii="Consolas" w:hAnsi="Consolas"/>
+                <w:sz w:val="20"/>
+              </w:rPr>
+              <w:t>y_train = np.log(data_train.price)    # log-transform</w:t>
+            </w:r>
+          </w:p>
+          <w:p>
+            <w:pPr>
+              <w:spacing w:after="0"/>
+            </w:pPr>
+            <w:r>
+              <w:rPr>
+                <w:rFonts w:ascii="Consolas" w:hAnsi="Consolas"/>
+                <w:sz w:val="20"/>
+              </w:rPr>
+            </w:r>
+          </w:p>
+          <w:p>
+            <w:pPr>
+              <w:spacing w:after="0"/>
+            </w:pPr>
+            <w:r>
+              <w:rPr>
+                <w:rFonts w:ascii="Consolas" w:hAnsi="Consolas"/>
+                <w:sz w:val="20"/>
+              </w:rPr>
+              <w:t>tree = DecisionTreeRegressor().fit(X_train, y_train)</w:t>
+            </w:r>
+          </w:p>
+          <w:p>
+            <w:pPr>
+              <w:spacing w:after="0"/>
+            </w:pPr>
+            <w:r>
+              <w:rPr>
+                <w:rFonts w:ascii="Consolas" w:hAnsi="Consolas"/>
+                <w:sz w:val="20"/>
+              </w:rPr>
+              <w:t>linear_reg = LinearRegression().fit(X_train, y_train)</w:t>
+            </w:r>
+          </w:p>
+          <w:p>
+            <w:pPr>
+              <w:spacing w:after="0"/>
+            </w:pPr>
+            <w:r>
+              <w:rPr>
+                <w:rFonts w:ascii="Consolas" w:hAnsi="Consolas"/>
+                <w:sz w:val="20"/>
+              </w:rPr>
+            </w:r>
+          </w:p>
+          <w:p>
+            <w:pPr>
+              <w:spacing w:after="0"/>
+            </w:pPr>
+            <w:r>
+              <w:rPr>
+                <w:rFonts w:ascii="Consolas" w:hAnsi="Consolas"/>
+                <w:sz w:val="20"/>
+              </w:rPr>
+              <w:t>X_all = ram_prices.date[:, np.newaxis]</w:t>
+            </w:r>
+          </w:p>
+          <w:p>
+            <w:pPr>
+              <w:spacing w:after="0"/>
+            </w:pPr>
+            <w:r>
+              <w:rPr>
+                <w:rFonts w:ascii="Consolas" w:hAnsi="Consolas"/>
+                <w:sz w:val="20"/>
+              </w:rPr>
+              <w:t>pred_tree = tree.predict(X_all)</w:t>
+            </w:r>
+          </w:p>
+          <w:p>
+            <w:pPr>
+              <w:spacing w:after="0"/>
+            </w:pPr>
+            <w:r>
+              <w:rPr>
+                <w:rFonts w:ascii="Consolas" w:hAnsi="Consolas"/>
+                <w:sz w:val="20"/>
+              </w:rPr>
+              <w:t>pred_lr = linear_reg.predict(X_all)</w:t>
+            </w:r>
+          </w:p>
+          <w:p>
+            <w:pPr>
+              <w:spacing w:after="0"/>
+            </w:pPr>
+            <w:r>
+              <w:rPr>
+                <w:rFonts w:ascii="Consolas" w:hAnsi="Consolas"/>
+                <w:sz w:val="20"/>
+              </w:rPr>
+            </w:r>
+          </w:p>
+          <w:p>
+            <w:pPr>
+              <w:spacing w:after="0"/>
+            </w:pPr>
+            <w:r>
+              <w:rPr>
+                <w:rFonts w:ascii="Consolas" w:hAnsi="Consolas"/>
+                <w:sz w:val="20"/>
+              </w:rPr>
+              <w:t>price_tree = np.exp(pred_tree)        # undo log-transform</w:t>
+            </w:r>
+          </w:p>
+          <w:p>
+            <w:pPr>
+              <w:spacing w:after="0"/>
+            </w:pPr>
+            <w:r>
+              <w:rPr>
+                <w:rFonts w:ascii="Consolas" w:hAnsi="Consolas"/>
+                <w:sz w:val="20"/>
+              </w:rPr>
+              <w:t>price_lr = np.exp(pred_lr)</w:t>
+            </w:r>
+          </w:p>
+        </w:tc>
+      </w:tr>
+    </w:tbl>
+    <w:p>
+      <w:pPr>
+        <w:spacing w:after="40"/>
+      </w:pPr>
+    </w:p>
+    <w:tbl>
+      <w:tblPr>
+        <w:tblStyle w:val="TableGrid"/>
+        <w:tblW w:type="auto" w:w="0"/>
+        <w:tblLook w:firstColumn="1" w:firstRow="1" w:lastColumn="0" w:lastRow="0" w:noHBand="0" w:noVBand="1" w:val="04A0"/>
+      </w:tblPr>
+      <w:tblGrid>
+        <w:gridCol w:w="9360"/>
+      </w:tblGrid>
+      <w:tr>
+        <w:tc>
+          <w:tcPr>
+            <w:tcW w:type="dxa" w:w="9360"/>
+            <w:shd w:val="clear" w:color="auto" w:fill="F5F5F5"/>
+          </w:tcPr>
+          <w:p>
+            <w:r/>
+            <w:r>
+              <w:rPr>
+                <w:b/>
+              </w:rPr>
+              <w:t>Random forest</w:t>
+            </w:r>
+          </w:p>
+          <w:p>
+            <w:pPr>
+              <w:spacing w:after="0"/>
+            </w:pPr>
+            <w:r>
+              <w:rPr>
+                <w:rFonts w:ascii="Consolas" w:hAnsi="Consolas"/>
+                <w:sz w:val="20"/>
+              </w:rPr>
+              <w:t>from sklearn.ensemble import RandomForestClassifier</w:t>
+            </w:r>
+          </w:p>
+          <w:p>
+            <w:pPr>
+              <w:spacing w:after="0"/>
+            </w:pPr>
+            <w:r>
+              <w:rPr>
+                <w:rFonts w:ascii="Consolas" w:hAnsi="Consolas"/>
+                <w:sz w:val="20"/>
+              </w:rPr>
+              <w:t>from sklearn.datasets import make_moons</w:t>
+            </w:r>
+          </w:p>
+          <w:p>
+            <w:pPr>
+              <w:spacing w:after="0"/>
+            </w:pPr>
+            <w:r>
+              <w:rPr>
+                <w:rFonts w:ascii="Consolas" w:hAnsi="Consolas"/>
+                <w:sz w:val="20"/>
+              </w:rPr>
+            </w:r>
+          </w:p>
+          <w:p>
+            <w:pPr>
+              <w:spacing w:after="0"/>
+            </w:pPr>
+            <w:r>
+              <w:rPr>
+                <w:rFonts w:ascii="Consolas" w:hAnsi="Consolas"/>
+                <w:sz w:val="20"/>
+              </w:rPr>
+              <w:t>X, y = make_moons(n_samples=100, noise=0.25, random_state=3)</w:t>
+            </w:r>
+          </w:p>
+          <w:p>
+            <w:pPr>
+              <w:spacing w:after="0"/>
+            </w:pPr>
+            <w:r>
+              <w:rPr>
+                <w:rFonts w:ascii="Consolas" w:hAnsi="Consolas"/>
+                <w:sz w:val="20"/>
+              </w:rPr>
+              <w:t>X_train, X_test, y_train, y_test = train_test_split(X, y, stratify=y,</w:t>
+            </w:r>
+          </w:p>
+          <w:p>
+            <w:pPr>
+              <w:spacing w:after="0"/>
+            </w:pPr>
+            <w:r>
+              <w:rPr>
+                <w:rFonts w:ascii="Consolas" w:hAnsi="Consolas"/>
+                <w:sz w:val="20"/>
+              </w:rPr>
+              <w:t xml:space="preserve">                                                    random_state=42)</w:t>
+            </w:r>
+          </w:p>
+          <w:p>
+            <w:pPr>
+              <w:spacing w:after="0"/>
+            </w:pPr>
+            <w:r>
+              <w:rPr>
+                <w:rFonts w:ascii="Consolas" w:hAnsi="Consolas"/>
+                <w:sz w:val="20"/>
+              </w:rPr>
+              <w:t>forest = RandomForestClassifier(n_estimators=5, random_state=2)</w:t>
+            </w:r>
+          </w:p>
+          <w:p>
+            <w:pPr>
+              <w:spacing w:after="0"/>
+            </w:pPr>
+            <w:r>
+              <w:rPr>
+                <w:rFonts w:ascii="Consolas" w:hAnsi="Consolas"/>
+                <w:sz w:val="20"/>
+              </w:rPr>
+              <w:t>forest.fit(X_train, y_train)</w:t>
+            </w:r>
+          </w:p>
+          <w:p>
+            <w:pPr>
+              <w:spacing w:after="0"/>
+            </w:pPr>
+            <w:r>
+              <w:rPr>
+                <w:rFonts w:ascii="Consolas" w:hAnsi="Consolas"/>
+                <w:sz w:val="20"/>
+              </w:rPr>
+            </w:r>
+          </w:p>
+          <w:p>
+            <w:pPr>
+              <w:spacing w:after="0"/>
+            </w:pPr>
+            <w:r>
+              <w:rPr>
+                <w:rFonts w:ascii="Consolas" w:hAnsi="Consolas"/>
+                <w:sz w:val="20"/>
+              </w:rPr>
+              <w:t># 100 trees on breast cancer</w:t>
+            </w:r>
+          </w:p>
+          <w:p>
+            <w:pPr>
+              <w:spacing w:after="0"/>
+            </w:pPr>
+            <w:r>
+              <w:rPr>
+                <w:rFonts w:ascii="Consolas" w:hAnsi="Consolas"/>
+                <w:sz w:val="20"/>
+              </w:rPr>
+              <w:t>X_train, X_test, y_train, y_test = train_test_split(</w:t>
+            </w:r>
+          </w:p>
+          <w:p>
+            <w:pPr>
+              <w:spacing w:after="0"/>
+            </w:pPr>
+            <w:r>
+              <w:rPr>
+                <w:rFonts w:ascii="Consolas" w:hAnsi="Consolas"/>
+                <w:sz w:val="20"/>
+              </w:rPr>
+              <w:t xml:space="preserve">    cancer.data, cancer.target, random_state=0)</w:t>
+            </w:r>
+          </w:p>
+          <w:p>
+            <w:pPr>
+              <w:spacing w:after="0"/>
+            </w:pPr>
+            <w:r>
+              <w:rPr>
+                <w:rFonts w:ascii="Consolas" w:hAnsi="Consolas"/>
+                <w:sz w:val="20"/>
+              </w:rPr>
+              <w:t>forest = RandomForestClassifier(n_estimators=100, random_state=0)</w:t>
+            </w:r>
+          </w:p>
+          <w:p>
+            <w:pPr>
+              <w:spacing w:after="0"/>
+            </w:pPr>
+            <w:r>
+              <w:rPr>
+                <w:rFonts w:ascii="Consolas" w:hAnsi="Consolas"/>
+                <w:sz w:val="20"/>
+              </w:rPr>
+              <w:t>forest.fit(X_train, y_train)</w:t>
+            </w:r>
+          </w:p>
+          <w:p>
+            <w:pPr>
+              <w:spacing w:after="0"/>
+            </w:pPr>
+            <w:r>
+              <w:rPr>
+                <w:rFonts w:ascii="Consolas" w:hAnsi="Consolas"/>
+                <w:sz w:val="20"/>
+              </w:rPr>
+              <w:t>print("Accuracy on training set: {:.3f}".format(forest.score(X_train, y_train)))</w:t>
+            </w:r>
+          </w:p>
+          <w:p>
+            <w:pPr>
+              <w:spacing w:after="0"/>
+            </w:pPr>
+            <w:r>
+              <w:rPr>
+                <w:rFonts w:ascii="Consolas" w:hAnsi="Consolas"/>
+                <w:sz w:val="20"/>
+              </w:rPr>
+              <w:t>print("Accuracy on test set: {:.3f}".format(forest.score(X_test, y_test)))</w:t>
+            </w:r>
+          </w:p>
+        </w:tc>
+      </w:tr>
+    </w:tbl>
+    <w:p>
+      <w:pPr>
+        <w:spacing w:after="40"/>
+      </w:pPr>
+    </w:p>
+    <w:tbl>
+      <w:tblPr>
+        <w:tblStyle w:val="TableGrid"/>
+        <w:tblW w:type="auto" w:w="0"/>
+        <w:tblLook w:firstColumn="1" w:firstRow="1" w:lastColumn="0" w:lastRow="0" w:noHBand="0" w:noVBand="1" w:val="04A0"/>
+      </w:tblPr>
+      <w:tblGrid>
+        <w:gridCol w:w="9360"/>
+      </w:tblGrid>
+      <w:tr>
+        <w:tc>
+          <w:tcPr>
+            <w:tcW w:type="dxa" w:w="9360"/>
+            <w:shd w:val="clear" w:color="auto" w:fill="F5F5F5"/>
+          </w:tcPr>
+          <w:p>
+            <w:r/>
+            <w:r>
+              <w:rPr>
+                <w:b/>
+              </w:rPr>
+              <w:t>Gradient boosting</w:t>
+            </w:r>
+          </w:p>
+          <w:p>
+            <w:pPr>
+              <w:spacing w:after="0"/>
+            </w:pPr>
+            <w:r>
+              <w:rPr>
+                <w:rFonts w:ascii="Consolas" w:hAnsi="Consolas"/>
+                <w:sz w:val="20"/>
+              </w:rPr>
+              <w:t>from sklearn.ensemble import GradientBoostingClassifier</w:t>
+            </w:r>
+          </w:p>
+          <w:p>
+            <w:pPr>
+              <w:spacing w:after="0"/>
+            </w:pPr>
+            <w:r>
+              <w:rPr>
+                <w:rFonts w:ascii="Consolas" w:hAnsi="Consolas"/>
+                <w:sz w:val="20"/>
+              </w:rPr>
+            </w:r>
+          </w:p>
+          <w:p>
+            <w:pPr>
+              <w:spacing w:after="0"/>
+            </w:pPr>
+            <w:r>
+              <w:rPr>
+                <w:rFonts w:ascii="Consolas" w:hAnsi="Consolas"/>
+                <w:sz w:val="20"/>
+              </w:rPr>
+              <w:t>X_train, X_test, y_train, y_test = train_test_split(</w:t>
+            </w:r>
+          </w:p>
+          <w:p>
+            <w:pPr>
+              <w:spacing w:after="0"/>
+            </w:pPr>
+            <w:r>
+              <w:rPr>
+                <w:rFonts w:ascii="Consolas" w:hAnsi="Consolas"/>
+                <w:sz w:val="20"/>
+              </w:rPr>
+              <w:t xml:space="preserve">    cancer.data, cancer.target, random_state=0)</w:t>
+            </w:r>
+          </w:p>
+          <w:p>
+            <w:pPr>
+              <w:spacing w:after="0"/>
+            </w:pPr>
+            <w:r>
+              <w:rPr>
+                <w:rFonts w:ascii="Consolas" w:hAnsi="Consolas"/>
+                <w:sz w:val="20"/>
+              </w:rPr>
+            </w:r>
+          </w:p>
+          <w:p>
+            <w:pPr>
+              <w:spacing w:after="0"/>
+            </w:pPr>
+            <w:r>
+              <w:rPr>
+                <w:rFonts w:ascii="Consolas" w:hAnsi="Consolas"/>
+                <w:sz w:val="20"/>
+              </w:rPr>
+              <w:t>gbrt = GradientBoostingClassifier(random_state=0)</w:t>
+            </w:r>
+          </w:p>
+          <w:p>
+            <w:pPr>
+              <w:spacing w:after="0"/>
+            </w:pPr>
+            <w:r>
+              <w:rPr>
+                <w:rFonts w:ascii="Consolas" w:hAnsi="Consolas"/>
+                <w:sz w:val="20"/>
+              </w:rPr>
+              <w:t>gbrt.fit(X_train, y_train)</w:t>
+            </w:r>
+          </w:p>
+          <w:p>
+            <w:pPr>
+              <w:spacing w:after="0"/>
+            </w:pPr>
+            <w:r>
+              <w:rPr>
+                <w:rFonts w:ascii="Consolas" w:hAnsi="Consolas"/>
+                <w:sz w:val="20"/>
+              </w:rPr>
+              <w:t>print("Accuracy on training set: {:.3f}".format(gbrt.score(X_train, y_train)))</w:t>
+            </w:r>
+          </w:p>
+          <w:p>
+            <w:pPr>
+              <w:spacing w:after="0"/>
+            </w:pPr>
+            <w:r>
+              <w:rPr>
+                <w:rFonts w:ascii="Consolas" w:hAnsi="Consolas"/>
+                <w:sz w:val="20"/>
+              </w:rPr>
+              <w:t>print("Accuracy on test set: {:.3f}".format(gbrt.score(X_test, y_test)))</w:t>
+            </w:r>
+          </w:p>
+          <w:p>
+            <w:pPr>
+              <w:spacing w:after="0"/>
+            </w:pPr>
+            <w:r>
+              <w:rPr>
+                <w:rFonts w:ascii="Consolas" w:hAnsi="Consolas"/>
+                <w:sz w:val="20"/>
+              </w:rPr>
+            </w:r>
+          </w:p>
+          <w:p>
+            <w:pPr>
+              <w:spacing w:after="0"/>
+            </w:pPr>
+            <w:r>
+              <w:rPr>
+                <w:rFonts w:ascii="Consolas" w:hAnsi="Consolas"/>
+                <w:sz w:val="20"/>
+              </w:rPr>
+              <w:t>gbrt = GradientBoostingClassifier(random_state=0, max_depth=1)       # stronger pre-pruning</w:t>
+            </w:r>
+          </w:p>
+          <w:p>
+            <w:pPr>
+              <w:spacing w:after="0"/>
+            </w:pPr>
+            <w:r>
+              <w:rPr>
+                <w:rFonts w:ascii="Consolas" w:hAnsi="Consolas"/>
+                <w:sz w:val="20"/>
+              </w:rPr>
+              <w:t>gbrt = GradientBoostingClassifier(random_state=0, learning_rate=0.01)   # lower learning rate</w:t>
+            </w:r>
+          </w:p>
+        </w:tc>
+      </w:tr>
+    </w:tbl>
+    <w:p>
+      <w:pPr>
+        <w:spacing w:after="40"/>
+      </w:pPr>
+    </w:p>
+    <w:p>
+      <w:pPr>
+        <w:pStyle w:val="ListBullet"/>
+      </w:pPr>
+      <w:r>
+        <w:rPr>
+          <w:b w:val="0"/>
+        </w:rPr>
+        <w:t xml:space="preserve">Tree: </w:t>
+      </w:r>
+      <w:r>
+        <w:rPr>
+          <w:b/>
+        </w:rPr>
+        <w:t>max_depth=4</w:t>
+      </w:r>
+      <w:r>
+        <w:rPr>
+          <w:b w:val="0"/>
+        </w:rPr>
+        <w:t xml:space="preserve"> is the pre-pruning fix for the fully grown tree (full tree: train </w:t>
+      </w:r>
+      <w:r>
+        <w:rPr>
+          <w:b/>
+        </w:rPr>
+        <w:t>1.000</w:t>
+      </w:r>
+      <w:r>
+        <w:rPr>
+          <w:b w:val="0"/>
+        </w:rPr>
+        <w:t xml:space="preserve">, test </w:t>
+      </w:r>
+      <w:r>
+        <w:rPr>
+          <w:b/>
+        </w:rPr>
+        <w:t>0.937</w:t>
+      </w:r>
+      <w:r>
+        <w:rPr>
+          <w:b w:val="0"/>
+        </w:rPr>
+        <w:t xml:space="preserve">; max_depth=4: train </w:t>
+      </w:r>
+      <w:r>
+        <w:rPr>
+          <w:b/>
+        </w:rPr>
+        <w:t>0.988</w:t>
+      </w:r>
+      <w:r>
+        <w:rPr>
+          <w:b w:val="0"/>
+        </w:rPr>
+        <w:t xml:space="preserve">, test </w:t>
+      </w:r>
+      <w:r>
+        <w:rPr>
+          <w:b/>
+        </w:rPr>
+        <w:t>0.951</w:t>
+      </w:r>
+      <w:r>
+        <w:rPr>
+          <w:b w:val="0"/>
+        </w:rPr>
+        <w:t xml:space="preserve">). </w:t>
+      </w:r>
+      <w:r>
+        <w:rPr>
+          <w:b/>
+        </w:rPr>
+        <w:t>random_state=0</w:t>
+      </w:r>
+      <w:r>
+        <w:rPr>
+          <w:b w:val="0"/>
+        </w:rPr>
+        <w:t xml:space="preserve"> keeps the tree repeatable.</w:t>
+      </w:r>
+    </w:p>
+    <w:p>
+      <w:pPr>
+        <w:pStyle w:val="ListBullet"/>
+      </w:pPr>
+      <w:r>
+        <w:rPr>
+          <w:b w:val="0"/>
+        </w:rPr>
+        <w:t xml:space="preserve">Forest: </w:t>
+      </w:r>
+      <w:r>
+        <w:rPr>
+          <w:b/>
+        </w:rPr>
+        <w:t>n_estimators</w:t>
+      </w:r>
+      <w:r>
+        <w:rPr>
+          <w:b w:val="0"/>
+        </w:rPr>
+        <w:t xml:space="preserve"> = number of trees (5 on moons, 100 on breast cancer); </w:t>
+      </w:r>
+      <w:r>
+        <w:rPr>
+          <w:b/>
+        </w:rPr>
+        <w:t>max_features</w:t>
+      </w:r>
+      <w:r>
+        <w:rPr>
+          <w:b w:val="0"/>
+        </w:rPr>
+        <w:t xml:space="preserve"> is the other key parameter.</w:t>
+      </w:r>
+    </w:p>
+    <w:p>
+      <w:pPr>
+        <w:pStyle w:val="ListBullet"/>
+      </w:pPr>
+      <w:r>
+        <w:rPr>
+          <w:b w:val="0"/>
+        </w:rPr>
+        <w:t xml:space="preserve">Gradient boosting defaults: </w:t>
+      </w:r>
+      <w:r>
+        <w:rPr>
+          <w:b/>
+        </w:rPr>
+        <w:t>n_estimators=100, max_depth=3, learning_rate=0.1</w:t>
+      </w:r>
+      <w:r>
+        <w:rPr>
+          <w:b w:val="0"/>
+        </w:rPr>
+        <w:t xml:space="preserve">. Overfit fix: </w:t>
+      </w:r>
+      <w:r>
+        <w:rPr>
+          <w:b/>
+        </w:rPr>
+        <w:t>lower max_depth</w:t>
+      </w:r>
+      <w:r>
+        <w:rPr>
+          <w:b w:val="0"/>
+        </w:rPr>
+        <w:t xml:space="preserve"> or </w:t>
+      </w:r>
+      <w:r>
+        <w:rPr>
+          <w:b/>
+        </w:rPr>
+        <w:t>lower learning_rate</w:t>
+      </w:r>
+      <w:r>
+        <w:rPr>
+          <w:b w:val="0"/>
+        </w:rPr>
+        <w:t>.</w:t>
+      </w:r>
+    </w:p>
+    <w:p>
+      <w:pPr>
+        <w:pStyle w:val="ListBullet"/>
+      </w:pPr>
+      <w:r>
+        <w:rPr>
+          <w:b w:val="0"/>
+        </w:rPr>
+        <w:t xml:space="preserve">Trees and forests need </w:t>
+      </w:r>
+      <w:r>
+        <w:rPr>
+          <w:b/>
+        </w:rPr>
+        <w:t>no scaling</w:t>
+      </w:r>
+      <w:r>
+        <w:rPr>
+          <w:b w:val="0"/>
+        </w:rPr>
+        <w:t>.</w:t>
+      </w:r>
+    </w:p>
+    <w:p>
+      <w:pPr>
+        <w:pStyle w:val="Heading2"/>
+      </w:pPr>
+      <w:r>
+        <w:t>Code 9. Support Vector Machines</w:t>
+      </w:r>
+    </w:p>
+    <w:tbl>
+      <w:tblPr>
+        <w:tblStyle w:val="TableGrid"/>
+        <w:tblW w:type="auto" w:w="0"/>
+        <w:tblLook w:firstColumn="1" w:firstRow="1" w:lastColumn="0" w:lastRow="0" w:noHBand="0" w:noVBand="1" w:val="04A0"/>
+      </w:tblPr>
+      <w:tblGrid>
+        <w:gridCol w:w="9360"/>
+      </w:tblGrid>
+      <w:tr>
+        <w:tc>
+          <w:tcPr>
+            <w:tcW w:type="dxa" w:w="9360"/>
+            <w:shd w:val="clear" w:color="auto" w:fill="F5F5F5"/>
+          </w:tcPr>
+          <w:p>
+            <w:r/>
+            <w:r>
+              <w:rPr>
+                <w:b/>
+              </w:rPr>
+              <w:t>Linear SVM and RBF kernel SVM</w:t>
+            </w:r>
+          </w:p>
+          <w:p>
+            <w:pPr>
+              <w:spacing w:after="0"/>
+            </w:pPr>
+            <w:r>
+              <w:rPr>
+                <w:rFonts w:ascii="Consolas" w:hAnsi="Consolas"/>
+                <w:sz w:val="20"/>
+              </w:rPr>
+              <w:t>from sklearn.svm import LinearSVC</w:t>
+            </w:r>
+          </w:p>
+          <w:p>
+            <w:pPr>
+              <w:spacing w:after="0"/>
+            </w:pPr>
+            <w:r>
+              <w:rPr>
+                <w:rFonts w:ascii="Consolas" w:hAnsi="Consolas"/>
+                <w:sz w:val="20"/>
+              </w:rPr>
+              <w:t>linear_svm = LinearSVC().fit(X, y)</w:t>
+            </w:r>
+          </w:p>
+          <w:p>
+            <w:pPr>
+              <w:spacing w:after="0"/>
+            </w:pPr>
+            <w:r>
+              <w:rPr>
+                <w:rFonts w:ascii="Consolas" w:hAnsi="Consolas"/>
+                <w:sz w:val="20"/>
+              </w:rPr>
+            </w:r>
+          </w:p>
+          <w:p>
+            <w:pPr>
+              <w:spacing w:after="0"/>
+            </w:pPr>
+            <w:r>
+              <w:rPr>
+                <w:rFonts w:ascii="Consolas" w:hAnsi="Consolas"/>
+                <w:sz w:val="20"/>
+              </w:rPr>
+              <w:t>from sklearn.svm import SVC</w:t>
+            </w:r>
+          </w:p>
+          <w:p>
+            <w:pPr>
+              <w:spacing w:after="0"/>
+            </w:pPr>
+            <w:r>
+              <w:rPr>
+                <w:rFonts w:ascii="Consolas" w:hAnsi="Consolas"/>
+                <w:sz w:val="20"/>
+              </w:rPr>
+              <w:t>svm = SVC(kernel='rbf', C=10, gamma=0.1).fit(X, y)</w:t>
+            </w:r>
+          </w:p>
+          <w:p>
+            <w:pPr>
+              <w:spacing w:after="0"/>
+            </w:pPr>
+            <w:r>
+              <w:rPr>
+                <w:rFonts w:ascii="Consolas" w:hAnsi="Consolas"/>
+                <w:sz w:val="20"/>
+              </w:rPr>
+            </w:r>
+          </w:p>
+          <w:p>
+            <w:pPr>
+              <w:spacing w:after="0"/>
+            </w:pPr>
+            <w:r>
+              <w:rPr>
+                <w:rFonts w:ascii="Consolas" w:hAnsi="Consolas"/>
+                <w:sz w:val="20"/>
+              </w:rPr>
+              <w:t>svc = SVC()</w:t>
+            </w:r>
+          </w:p>
+          <w:p>
+            <w:pPr>
+              <w:spacing w:after="0"/>
+            </w:pPr>
+            <w:r>
+              <w:rPr>
+                <w:rFonts w:ascii="Consolas" w:hAnsi="Consolas"/>
+                <w:sz w:val="20"/>
+              </w:rPr>
+              <w:t>svc.fit(X_train, y_train)</w:t>
+            </w:r>
+          </w:p>
+          <w:p>
+            <w:pPr>
+              <w:spacing w:after="0"/>
+            </w:pPr>
+            <w:r>
+              <w:rPr>
+                <w:rFonts w:ascii="Consolas" w:hAnsi="Consolas"/>
+                <w:sz w:val="20"/>
+              </w:rPr>
+              <w:t>print("Accuracy on training set: {:.2f}".format(svc.score(X_train, y_train)))</w:t>
+            </w:r>
+          </w:p>
+          <w:p>
+            <w:pPr>
+              <w:spacing w:after="0"/>
+            </w:pPr>
+            <w:r>
+              <w:rPr>
+                <w:rFonts w:ascii="Consolas" w:hAnsi="Consolas"/>
+                <w:sz w:val="20"/>
+              </w:rPr>
+              <w:t>print("Accuracy on test set: {:.2f}".format(svc.score(X_test, y_test)))</w:t>
+            </w:r>
+          </w:p>
+        </w:tc>
+      </w:tr>
+    </w:tbl>
+    <w:p>
+      <w:pPr>
+        <w:spacing w:after="40"/>
+      </w:pPr>
+    </w:p>
+    <w:tbl>
+      <w:tblPr>
+        <w:tblStyle w:val="TableGrid"/>
+        <w:tblW w:type="auto" w:w="0"/>
+        <w:tblLook w:firstColumn="1" w:firstRow="1" w:lastColumn="0" w:lastRow="0" w:noHBand="0" w:noVBand="1" w:val="04A0"/>
+      </w:tblPr>
+      <w:tblGrid>
+        <w:gridCol w:w="9360"/>
+      </w:tblGrid>
+      <w:tr>
+        <w:tc>
+          <w:tcPr>
+            <w:tcW w:type="dxa" w:w="9360"/>
+            <w:shd w:val="clear" w:color="auto" w:fill="F5F5F5"/>
+          </w:tcPr>
+          <w:p>
+            <w:r/>
+            <w:r>
+              <w:rPr>
+                <w:b/>
+              </w:rPr>
+              <w:t>Scaling by hand to 0-1 (the slides do NOT use MinMaxScaler here)</w:t>
+            </w:r>
+          </w:p>
+          <w:p>
+            <w:pPr>
+              <w:spacing w:after="0"/>
+            </w:pPr>
+            <w:r>
+              <w:rPr>
+                <w:rFonts w:ascii="Consolas" w:hAnsi="Consolas"/>
+                <w:sz w:val="20"/>
+              </w:rPr>
+              <w:t># compute the minimum value per feature on the training set</w:t>
+            </w:r>
+          </w:p>
+          <w:p>
+            <w:pPr>
+              <w:spacing w:after="0"/>
+            </w:pPr>
+            <w:r>
+              <w:rPr>
+                <w:rFonts w:ascii="Consolas" w:hAnsi="Consolas"/>
+                <w:sz w:val="20"/>
+              </w:rPr>
+              <w:t>min_on_training = X_train.min(axis=0)</w:t>
+            </w:r>
+          </w:p>
+          <w:p>
+            <w:pPr>
+              <w:spacing w:after="0"/>
+            </w:pPr>
+            <w:r>
+              <w:rPr>
+                <w:rFonts w:ascii="Consolas" w:hAnsi="Consolas"/>
+                <w:sz w:val="20"/>
+              </w:rPr>
+              <w:t># compute the range of each feature (max - min) on the training set</w:t>
+            </w:r>
+          </w:p>
+          <w:p>
+            <w:pPr>
+              <w:spacing w:after="0"/>
+            </w:pPr>
+            <w:r>
+              <w:rPr>
+                <w:rFonts w:ascii="Consolas" w:hAnsi="Consolas"/>
+                <w:sz w:val="20"/>
+              </w:rPr>
+              <w:t>range_on_training = (X_train - min_on_training).max(axis=0)</w:t>
+            </w:r>
+          </w:p>
+          <w:p>
+            <w:pPr>
+              <w:spacing w:after="0"/>
+            </w:pPr>
+            <w:r>
+              <w:rPr>
+                <w:rFonts w:ascii="Consolas" w:hAnsi="Consolas"/>
+                <w:sz w:val="20"/>
+              </w:rPr>
+            </w:r>
+          </w:p>
+          <w:p>
+            <w:pPr>
+              <w:spacing w:after="0"/>
+            </w:pPr>
+            <w:r>
+              <w:rPr>
+                <w:rFonts w:ascii="Consolas" w:hAnsi="Consolas"/>
+                <w:sz w:val="20"/>
+              </w:rPr>
+              <w:t># subtract the min, and divide by range</w:t>
+            </w:r>
+          </w:p>
+          <w:p>
+            <w:pPr>
+              <w:spacing w:after="0"/>
+            </w:pPr>
+            <w:r>
+              <w:rPr>
+                <w:rFonts w:ascii="Consolas" w:hAnsi="Consolas"/>
+                <w:sz w:val="20"/>
+              </w:rPr>
+              <w:t># afterward, min=0 and max=1 for each feature</w:t>
+            </w:r>
+          </w:p>
+          <w:p>
+            <w:pPr>
+              <w:spacing w:after="0"/>
+            </w:pPr>
+            <w:r>
+              <w:rPr>
+                <w:rFonts w:ascii="Consolas" w:hAnsi="Consolas"/>
+                <w:sz w:val="20"/>
+              </w:rPr>
+              <w:t>X_train_scaled = (X_train - min_on_training) / range_on_training</w:t>
+            </w:r>
+          </w:p>
+          <w:p>
+            <w:pPr>
+              <w:spacing w:after="0"/>
+            </w:pPr>
+            <w:r>
+              <w:rPr>
+                <w:rFonts w:ascii="Consolas" w:hAnsi="Consolas"/>
+                <w:sz w:val="20"/>
+              </w:rPr>
+            </w:r>
+          </w:p>
+          <w:p>
+            <w:pPr>
+              <w:spacing w:after="0"/>
+            </w:pPr>
+            <w:r>
+              <w:rPr>
+                <w:rFonts w:ascii="Consolas" w:hAnsi="Consolas"/>
+                <w:sz w:val="20"/>
+              </w:rPr>
+              <w:t># use THE SAME transformation on the test set,</w:t>
+            </w:r>
+          </w:p>
+          <w:p>
+            <w:pPr>
+              <w:spacing w:after="0"/>
+            </w:pPr>
+            <w:r>
+              <w:rPr>
+                <w:rFonts w:ascii="Consolas" w:hAnsi="Consolas"/>
+                <w:sz w:val="20"/>
+              </w:rPr>
+              <w:t># using min and range of the training set</w:t>
+            </w:r>
+          </w:p>
+          <w:p>
+            <w:pPr>
+              <w:spacing w:after="0"/>
+            </w:pPr>
+            <w:r>
+              <w:rPr>
+                <w:rFonts w:ascii="Consolas" w:hAnsi="Consolas"/>
+                <w:sz w:val="20"/>
+              </w:rPr>
+              <w:t>X_test_scaled = (X_test - min_on_training) / range_on_training</w:t>
+            </w:r>
+          </w:p>
+          <w:p>
+            <w:pPr>
+              <w:spacing w:after="0"/>
+            </w:pPr>
+            <w:r>
+              <w:rPr>
+                <w:rFonts w:ascii="Consolas" w:hAnsi="Consolas"/>
+                <w:sz w:val="20"/>
+              </w:rPr>
+            </w:r>
+          </w:p>
+          <w:p>
+            <w:pPr>
+              <w:spacing w:after="0"/>
+            </w:pPr>
+            <w:r>
+              <w:rPr>
+                <w:rFonts w:ascii="Consolas" w:hAnsi="Consolas"/>
+                <w:sz w:val="20"/>
+              </w:rPr>
+              <w:t>svc = SVC()</w:t>
+            </w:r>
+          </w:p>
+          <w:p>
+            <w:pPr>
+              <w:spacing w:after="0"/>
+            </w:pPr>
+            <w:r>
+              <w:rPr>
+                <w:rFonts w:ascii="Consolas" w:hAnsi="Consolas"/>
+                <w:sz w:val="20"/>
+              </w:rPr>
+              <w:t>svc.fit(X_train_scaled, y_train)</w:t>
+            </w:r>
+          </w:p>
+          <w:p>
+            <w:pPr>
+              <w:spacing w:after="0"/>
+            </w:pPr>
+            <w:r>
+              <w:rPr>
+                <w:rFonts w:ascii="Consolas" w:hAnsi="Consolas"/>
+                <w:sz w:val="20"/>
+              </w:rPr>
+              <w:t>print("Accuracy on training set: {:.3f}".format(svc.score(X_train_scaled, y_train)))</w:t>
+            </w:r>
+          </w:p>
+          <w:p>
+            <w:pPr>
+              <w:spacing w:after="0"/>
+            </w:pPr>
+            <w:r>
+              <w:rPr>
+                <w:rFonts w:ascii="Consolas" w:hAnsi="Consolas"/>
+                <w:sz w:val="20"/>
+              </w:rPr>
+              <w:t>print("Accuracy on test set: {:.3f}".format(svc.score(X_test_scaled, y_test)))</w:t>
+            </w:r>
+          </w:p>
+          <w:p>
+            <w:pPr>
+              <w:spacing w:after="0"/>
+            </w:pPr>
+            <w:r>
+              <w:rPr>
+                <w:rFonts w:ascii="Consolas" w:hAnsi="Consolas"/>
+                <w:sz w:val="20"/>
+              </w:rPr>
+            </w:r>
+          </w:p>
+          <w:p>
+            <w:pPr>
+              <w:spacing w:after="0"/>
+            </w:pPr>
+            <w:r>
+              <w:rPr>
+                <w:rFonts w:ascii="Consolas" w:hAnsi="Consolas"/>
+                <w:sz w:val="20"/>
+              </w:rPr>
+              <w:t>svc = SVC(C=1000)</w:t>
+            </w:r>
+          </w:p>
+          <w:p>
+            <w:pPr>
+              <w:spacing w:after="0"/>
+            </w:pPr>
+            <w:r>
+              <w:rPr>
+                <w:rFonts w:ascii="Consolas" w:hAnsi="Consolas"/>
+                <w:sz w:val="20"/>
+              </w:rPr>
+              <w:t>svc.fit(X_train_scaled, y_train)</w:t>
+            </w:r>
+          </w:p>
+        </w:tc>
+      </w:tr>
+    </w:tbl>
+    <w:p>
+      <w:pPr>
+        <w:spacing w:after="40"/>
+      </w:pPr>
+    </w:p>
+    <w:p>
+      <w:pPr>
+        <w:pStyle w:val="ListBullet"/>
+      </w:pPr>
+      <w:r>
+        <w:rPr>
+          <w:b w:val="0"/>
+        </w:rPr>
+        <w:t xml:space="preserve">Default SVC on the raw breast cancer data overfits (train </w:t>
+      </w:r>
+      <w:r>
+        <w:rPr>
+          <w:b/>
+        </w:rPr>
+        <w:t>1.00</w:t>
+      </w:r>
+      <w:r>
+        <w:rPr>
+          <w:b w:val="0"/>
+        </w:rPr>
+        <w:t xml:space="preserve">, test </w:t>
+      </w:r>
+      <w:r>
+        <w:rPr>
+          <w:b/>
+        </w:rPr>
+        <w:t>0.63</w:t>
+      </w:r>
+      <w:r>
+        <w:rPr>
+          <w:b w:val="0"/>
+        </w:rPr>
+        <w:t xml:space="preserve">). </w:t>
+      </w:r>
+      <w:r>
+        <w:rPr>
+          <w:b/>
+        </w:rPr>
+        <w:t>Scaled</w:t>
+      </w:r>
+      <w:r>
+        <w:rPr>
+          <w:b w:val="0"/>
+        </w:rPr>
+        <w:t xml:space="preserve">, default SVC gives train </w:t>
+      </w:r>
+      <w:r>
+        <w:rPr>
+          <w:b/>
+        </w:rPr>
+        <w:t>0.948</w:t>
+      </w:r>
+      <w:r>
+        <w:rPr>
+          <w:b w:val="0"/>
+        </w:rPr>
+        <w:t xml:space="preserve">, test </w:t>
+      </w:r>
+      <w:r>
+        <w:rPr>
+          <w:b/>
+        </w:rPr>
+        <w:t>0.951</w:t>
+      </w:r>
+      <w:r>
+        <w:rPr>
+          <w:b w:val="0"/>
+        </w:rPr>
+        <w:t xml:space="preserve">. </w:t>
+      </w:r>
+      <w:r>
+        <w:rPr>
+          <w:b/>
+        </w:rPr>
+        <w:t>C=1000</w:t>
+      </w:r>
+      <w:r>
+        <w:rPr>
+          <w:b w:val="0"/>
+        </w:rPr>
+        <w:t xml:space="preserve"> on scaled data gives train </w:t>
+      </w:r>
+      <w:r>
+        <w:rPr>
+          <w:b/>
+        </w:rPr>
+        <w:t>0.988</w:t>
+      </w:r>
+      <w:r>
+        <w:rPr>
+          <w:b w:val="0"/>
+        </w:rPr>
+        <w:t xml:space="preserve">, test </w:t>
+      </w:r>
+      <w:r>
+        <w:rPr>
+          <w:b/>
+        </w:rPr>
+        <w:t>0.972</w:t>
+      </w:r>
+      <w:r>
+        <w:rPr>
+          <w:b w:val="0"/>
+        </w:rPr>
+        <w:t>.</w:t>
+      </w:r>
+    </w:p>
+    <w:p>
+      <w:pPr>
+        <w:pStyle w:val="ListBullet"/>
+      </w:pPr>
+      <w:r>
+        <w:rPr>
+          <w:b w:val="0"/>
+        </w:rPr>
+        <w:t xml:space="preserve">The test set must use the </w:t>
+      </w:r>
+      <w:r>
+        <w:rPr>
+          <w:b/>
+        </w:rPr>
+        <w:t>training set's</w:t>
+      </w:r>
+      <w:r>
+        <w:rPr>
+          <w:b w:val="0"/>
+        </w:rPr>
+        <w:t xml:space="preserve"> min and range, never its own (that would leak information).</w:t>
+      </w:r>
+    </w:p>
+    <w:p>
+      <w:pPr>
+        <w:pStyle w:val="ListBullet"/>
+      </w:pPr>
+      <w:r>
+        <w:rPr>
+          <w:b/>
+        </w:rPr>
+        <w:t>MinMaxScaler</w:t>
+      </w:r>
+      <w:r>
+        <w:rPr>
+          <w:b w:val="0"/>
+        </w:rPr>
+        <w:t xml:space="preserve"> from sklearn.preprocessing does the same job and is what the M1 notebook uses.</w:t>
+      </w:r>
+    </w:p>
+    <w:tbl>
+      <w:tblPr>
+        <w:tblStyle w:val="TableGrid"/>
+        <w:tblW w:type="auto" w:w="0"/>
+        <w:tblLook w:firstColumn="1" w:firstRow="1" w:lastColumn="0" w:lastRow="0" w:noHBand="0" w:noVBand="1" w:val="04A0"/>
+      </w:tblPr>
+      <w:tblGrid>
+        <w:gridCol w:w="9360"/>
+      </w:tblGrid>
+      <w:tr>
+        <w:tc>
+          <w:tcPr>
+            <w:tcW w:type="dxa" w:w="9360"/>
+            <w:shd w:val="clear" w:color="auto" w:fill="FDECEA"/>
+          </w:tcPr>
+          <w:p>
+            <w:r/>
+            <w:r>
+              <w:rPr>
+                <w:b/>
+              </w:rPr>
+              <w:t>Watch Out</w:t>
+            </w:r>
+          </w:p>
+          <w:p>
+            <w:r>
+              <w:rPr>
+                <w:b w:val="0"/>
+              </w:rPr>
+              <w:t xml:space="preserve">Slide naming: k-NN is </w:t>
+            </w:r>
+            <w:r>
+              <w:rPr>
+                <w:b/>
+              </w:rPr>
+              <w:t>clf</w:t>
+            </w:r>
+            <w:r>
+              <w:rPr>
+                <w:b w:val="0"/>
+              </w:rPr>
+              <w:t xml:space="preserve">, the regressor is </w:t>
+            </w:r>
+            <w:r>
+              <w:rPr>
+                <w:b/>
+              </w:rPr>
+              <w:t>reg</w:t>
+            </w:r>
+            <w:r>
+              <w:rPr>
+                <w:b w:val="0"/>
+              </w:rPr>
+              <w:t xml:space="preserve">, ridge is </w:t>
+            </w:r>
+            <w:r>
+              <w:rPr>
+                <w:b/>
+              </w:rPr>
+              <w:t>ridge</w:t>
+            </w:r>
+            <w:r>
+              <w:rPr>
+                <w:b w:val="0"/>
+              </w:rPr>
+              <w:t xml:space="preserve">, the forest is </w:t>
+            </w:r>
+            <w:r>
+              <w:rPr>
+                <w:b/>
+              </w:rPr>
+              <w:t>forest</w:t>
+            </w:r>
+            <w:r>
+              <w:rPr>
+                <w:b w:val="0"/>
+              </w:rPr>
+              <w:t xml:space="preserve">, boosting is </w:t>
+            </w:r>
+            <w:r>
+              <w:rPr>
+                <w:b/>
+              </w:rPr>
+              <w:t>gbrt</w:t>
+            </w:r>
+            <w:r>
+              <w:rPr>
+                <w:b w:val="0"/>
+              </w:rPr>
+              <w:t xml:space="preserve">, and the SVM is </w:t>
+            </w:r>
+            <w:r>
+              <w:rPr>
+                <w:b/>
+              </w:rPr>
+              <w:t>svc</w:t>
+            </w:r>
+            <w:r>
+              <w:rPr>
+                <w:b w:val="0"/>
+              </w:rPr>
+              <w:t xml:space="preserve">. Every model follows the same pattern: create, </w:t>
+            </w:r>
+            <w:r>
+              <w:rPr>
+                <w:b/>
+              </w:rPr>
+              <w:t>fit(X_train, y_train)</w:t>
+            </w:r>
+            <w:r>
+              <w:rPr>
+                <w:b w:val="0"/>
+              </w:rPr>
+              <w:t xml:space="preserve">, then </w:t>
+            </w:r>
+            <w:r>
+              <w:rPr>
+                <w:b/>
+              </w:rPr>
+              <w:t>score</w:t>
+            </w:r>
+            <w:r>
+              <w:rPr>
+                <w:b w:val="0"/>
+              </w:rPr>
+              <w:t xml:space="preserve"> on train and on test. Classifiers report accuracy, regressors report R^2.</w:t>
             </w:r>
           </w:p>
         </w:tc>

</xml_diff>